<commit_message>
feat(completion): add account safeguards, Excel export, drill-down, backup and restore, accessibility fixes
</commit_message>
<xml_diff>
--- a/docs/reports/Progress_Report.docx
+++ b/docs/reports/Progress_Report.docx
@@ -323,7 +323,7 @@
                 <w:sz w:val="20"/>
                 <w:szCs w:val="20"/>
               </w:rPr>
-              <w:t xml:space="preserve">28 September 2026 (updated at the end of every phase)</w:t>
+              <w:t xml:space="preserve">3 October 2026 (updated at the end of every phase)</w:t>
             </w:r>
           </w:p>
         </w:tc>
@@ -573,7 +573,7 @@
           <w:sz w:val="24"/>
           <w:szCs w:val="24"/>
         </w:rPr>
-        <w:t xml:space="preserve">The development of the platform is well advanced. I have built and tested a working prototype that covers every module in my revised scope: secure sign-in with three roles, incident reporting with validation, bulk CSV import, duplicate detection and review, a data-quality summary, ten descriptive analytics measures on a dashboard, and CSV and PDF reports. Following the panel decision there is </w:t>
+        <w:t xml:space="preserve">The development of the platform is well advanced. I have built and tested a working prototype that covers every module in my revised scope: secure sign-in with three roles, incident reporting with validation, bulk CSV import, duplicate detection and review, a data-quality summary, ten descriptive analytics measures on an interactive dashboard, CSV, Excel and PDF reports, and a tested backup and restore procedure. Following the panel decision there is </w:t>
       </w:r>
       <w:r>
         <w:rPr>
@@ -609,7 +609,7 @@
           <w:sz w:val="24"/>
           <w:szCs w:val="24"/>
         </w:rPr>
-        <w:t xml:space="preserve">The prototype is covered by 284 automated tests and 16 browser tests, all passing. What remains is the </w:t>
+        <w:t xml:space="preserve">The prototype is covered by 305 automated tests and 20 browser tests, all passing. Every module promised in my proposal, apart from the GIS component the panel removed, is now built. What remains is the </w:t>
       </w:r>
       <w:r>
         <w:rPr>
@@ -649,27 +649,7 @@
           <w:sz w:val="24"/>
           <w:szCs w:val="24"/>
         </w:rPr>
-        <w:t xml:space="preserve"> with real participants, a small set of </w:t>
-      </w:r>
-      <w:r>
-        <w:rPr>
-          <w:rFonts w:ascii="Times New Roman" w:cs="Times New Roman" w:eastAsia="Times New Roman" w:hAnsi="Times New Roman"/>
-          <w:b/>
-          <w:bCs/>
-          <w:sz w:val="24"/>
-          <w:szCs w:val="24"/>
-        </w:rPr>
-        <w:t xml:space="preserve">development items</w:t>
-      </w:r>
-      <w:r>
-        <w:rPr>
-          <w:rFonts w:ascii="Times New Roman" w:cs="Times New Roman" w:eastAsia="Times New Roman" w:hAnsi="Times New Roman"/>
-          <w:b w:val="false"/>
-          <w:bCs w:val="false"/>
-          <w:sz w:val="24"/>
-          <w:szCs w:val="24"/>
-        </w:rPr>
-        <w:t xml:space="preserve"> that depend on decisions or on fieldwork findings (Section 6), the </w:t>
+        <w:t xml:space="preserve"> with real participants, the development changes that will come out of the fieldwork and usability sessions (Section 6), the </w:t>
       </w:r>
       <w:r>
         <w:rPr>
@@ -2327,6 +2307,139 @@
           </w:p>
         </w:tc>
       </w:tr>
+      <w:tr>
+        <w:trPr>
+          <w:tblHeader w:val="off"/>
+        </w:trPr>
+        <w:tc>
+          <w:tcPr>
+            <w:tcW w:type="dxa" w:w="2683"/>
+            <w:tcBorders>
+              <w:top w:val="single" w:color="999999" w:sz="4"/>
+              <w:left w:val="single" w:color="999999" w:sz="4"/>
+              <w:bottom w:val="single" w:color="999999" w:sz="4"/>
+              <w:right w:val="single" w:color="999999" w:sz="4"/>
+            </w:tcBorders>
+            <w:tcMar>
+              <w:top w:type="dxa" w:w="60"/>
+              <w:left w:type="dxa" w:w="100"/>
+              <w:bottom w:type="dxa" w:w="60"/>
+              <w:right w:type="dxa" w:w="100"/>
+            </w:tcMar>
+          </w:tcPr>
+          <w:p>
+            <w:pPr>
+              <w:spacing w:line="276"/>
+            </w:pPr>
+            <w:r>
+              <w:rPr>
+                <w:rFonts w:ascii="Times New Roman" w:cs="Times New Roman" w:eastAsia="Times New Roman" w:hAnsi="Times New Roman"/>
+                <w:b w:val="false"/>
+                <w:bCs w:val="false"/>
+                <w:sz w:val="20"/>
+                <w:szCs w:val="20"/>
+              </w:rPr>
+              <w:t xml:space="preserve">6b. Development completion</w:t>
+            </w:r>
+          </w:p>
+        </w:tc>
+        <w:tc>
+          <w:tcPr>
+            <w:tcW w:type="dxa" w:w="2744"/>
+            <w:tcBorders>
+              <w:top w:val="single" w:color="999999" w:sz="4"/>
+              <w:left w:val="single" w:color="999999" w:sz="4"/>
+              <w:bottom w:val="single" w:color="999999" w:sz="4"/>
+              <w:right w:val="single" w:color="999999" w:sz="4"/>
+            </w:tcBorders>
+            <w:tcMar>
+              <w:top w:type="dxa" w:w="60"/>
+              <w:left w:type="dxa" w:w="100"/>
+              <w:bottom w:type="dxa" w:w="60"/>
+              <w:right w:type="dxa" w:w="100"/>
+            </w:tcMar>
+          </w:tcPr>
+          <w:p>
+            <w:pPr>
+              <w:spacing w:line="276"/>
+            </w:pPr>
+            <w:r>
+              <w:rPr>
+                <w:rFonts w:ascii="Times New Roman" w:cs="Times New Roman" w:eastAsia="Times New Roman" w:hAnsi="Times New Roman"/>
+                <w:b w:val="false"/>
+                <w:bCs w:val="false"/>
+                <w:sz w:val="20"/>
+                <w:szCs w:val="20"/>
+              </w:rPr>
+              <w:t xml:space="preserve">Closed gaps I found when using the system: an administrator can no longer change their own password, role or status from the user screen, the last administrator cannot be removed, new users get a generated temporary password shown once, locked accounts can be unlocked, and password fields have a show or hide button. Added the remaining items from my proposal: Excel export, charts that open the matching incidents when clicked, backup and restore, and an accessibility check. Applied the stricter duplicate rule (house or plot numbers must match)</w:t>
+            </w:r>
+          </w:p>
+        </w:tc>
+        <w:tc>
+          <w:tcPr>
+            <w:tcW w:type="dxa" w:w="2744"/>
+            <w:tcBorders>
+              <w:top w:val="single" w:color="999999" w:sz="4"/>
+              <w:left w:val="single" w:color="999999" w:sz="4"/>
+              <w:bottom w:val="single" w:color="999999" w:sz="4"/>
+              <w:right w:val="single" w:color="999999" w:sz="4"/>
+            </w:tcBorders>
+            <w:tcMar>
+              <w:top w:type="dxa" w:w="60"/>
+              <w:left w:type="dxa" w:w="100"/>
+              <w:bottom w:type="dxa" w:w="60"/>
+              <w:right w:type="dxa" w:w="100"/>
+            </w:tcMar>
+          </w:tcPr>
+          <w:p>
+            <w:pPr>
+              <w:spacing w:line="276"/>
+            </w:pPr>
+            <w:r>
+              <w:rPr>
+                <w:rFonts w:ascii="Times New Roman" w:cs="Times New Roman" w:eastAsia="Times New Roman" w:hAnsi="Times New Roman"/>
+                <w:b w:val="false"/>
+                <w:bCs w:val="false"/>
+                <w:sz w:val="20"/>
+                <w:szCs w:val="20"/>
+              </w:rPr>
+              <w:t xml:space="preserve">310 tests and 20 browser tests; backup restored into a separate database and compared table by table; accessibility scan of 13 pages in both themes on laptop and phone screens</w:t>
+            </w:r>
+          </w:p>
+        </w:tc>
+        <w:tc>
+          <w:tcPr>
+            <w:tcW w:type="dxa" w:w="855"/>
+            <w:tcBorders>
+              <w:top w:val="single" w:color="999999" w:sz="4"/>
+              <w:left w:val="single" w:color="999999" w:sz="4"/>
+              <w:bottom w:val="single" w:color="999999" w:sz="4"/>
+              <w:right w:val="single" w:color="999999" w:sz="4"/>
+            </w:tcBorders>
+            <w:tcMar>
+              <w:top w:type="dxa" w:w="60"/>
+              <w:left w:type="dxa" w:w="100"/>
+              <w:bottom w:type="dxa" w:w="60"/>
+              <w:right w:type="dxa" w:w="100"/>
+            </w:tcMar>
+          </w:tcPr>
+          <w:p>
+            <w:pPr>
+              <w:spacing w:line="276"/>
+            </w:pPr>
+            <w:r>
+              <w:rPr>
+                <w:rFonts w:ascii="Times New Roman" w:cs="Times New Roman" w:eastAsia="Times New Roman" w:hAnsi="Times New Roman"/>
+                <w:b w:val="false"/>
+                <w:bCs w:val="false"/>
+                <w:sz w:val="20"/>
+                <w:szCs w:val="20"/>
+              </w:rPr>
+              <w:t xml:space="preserve">Done</w:t>
+            </w:r>
+          </w:p>
+        </w:tc>
+      </w:tr>
     </w:tbl>
     <w:p>
       <w:pPr>
@@ -2397,9 +2510,9 @@
         </w:tblBorders>
       </w:tblPr>
       <w:tblGrid>
-        <w:gridCol w:w="3312"/>
-        <w:gridCol w:w="3726"/>
-        <w:gridCol w:w="1988"/>
+        <w:gridCol w:w="3562"/>
+        <w:gridCol w:w="3562"/>
+        <w:gridCol w:w="1902"/>
       </w:tblGrid>
       <w:tr>
         <w:trPr>
@@ -2407,7 +2520,7 @@
         </w:trPr>
         <w:tc>
           <w:tcPr>
-            <w:tcW w:type="dxa" w:w="3312"/>
+            <w:tcW w:type="dxa" w:w="3562"/>
             <w:tcBorders>
               <w:top w:val="single" w:color="999999" w:sz="4"/>
               <w:left w:val="single" w:color="999999" w:sz="4"/>
@@ -2440,7 +2553,7 @@
         </w:tc>
         <w:tc>
           <w:tcPr>
-            <w:tcW w:type="dxa" w:w="3726"/>
+            <w:tcW w:type="dxa" w:w="3562"/>
             <w:tcBorders>
               <w:top w:val="single" w:color="999999" w:sz="4"/>
               <w:left w:val="single" w:color="999999" w:sz="4"/>
@@ -2473,7 +2586,7 @@
         </w:tc>
         <w:tc>
           <w:tcPr>
-            <w:tcW w:type="dxa" w:w="1988"/>
+            <w:tcW w:type="dxa" w:w="1902"/>
             <w:tcBorders>
               <w:top w:val="single" w:color="999999" w:sz="4"/>
               <w:left w:val="single" w:color="999999" w:sz="4"/>
@@ -2511,7 +2624,7 @@
         </w:trPr>
         <w:tc>
           <w:tcPr>
-            <w:tcW w:type="dxa" w:w="3312"/>
+            <w:tcW w:type="dxa" w:w="3562"/>
             <w:tcBorders>
               <w:top w:val="single" w:color="999999" w:sz="4"/>
               <w:left w:val="single" w:color="999999" w:sz="4"/>
@@ -2543,39 +2656,39 @@
         </w:tc>
         <w:tc>
           <w:tcPr>
-            <w:tcW w:type="dxa" w:w="3726"/>
-            <w:tcBorders>
-              <w:top w:val="single" w:color="999999" w:sz="4"/>
-              <w:left w:val="single" w:color="999999" w:sz="4"/>
-              <w:bottom w:val="single" w:color="999999" w:sz="4"/>
-              <w:right w:val="single" w:color="999999" w:sz="4"/>
-            </w:tcBorders>
-            <w:tcMar>
-              <w:top w:type="dxa" w:w="60"/>
-              <w:left w:type="dxa" w:w="100"/>
-              <w:bottom w:type="dxa" w:w="60"/>
-              <w:right w:type="dxa" w:w="100"/>
-            </w:tcMar>
-          </w:tcPr>
-          <w:p>
-            <w:pPr>
-              <w:spacing w:line="276"/>
-            </w:pPr>
-            <w:r>
-              <w:rPr>
-                <w:rFonts w:ascii="Times New Roman" w:cs="Times New Roman" w:eastAsia="Times New Roman" w:hAnsi="Times New Roman"/>
-                <w:b w:val="false"/>
-                <w:bCs w:val="false"/>
-                <w:sz w:val="20"/>
-                <w:szCs w:val="20"/>
-              </w:rPr>
-              <w:t xml:space="preserve">284 tests and 16 browser tests, all passing</w:t>
-            </w:r>
-          </w:p>
-        </w:tc>
-        <w:tc>
-          <w:tcPr>
-            <w:tcW w:type="dxa" w:w="1988"/>
+            <w:tcW w:type="dxa" w:w="3562"/>
+            <w:tcBorders>
+              <w:top w:val="single" w:color="999999" w:sz="4"/>
+              <w:left w:val="single" w:color="999999" w:sz="4"/>
+              <w:bottom w:val="single" w:color="999999" w:sz="4"/>
+              <w:right w:val="single" w:color="999999" w:sz="4"/>
+            </w:tcBorders>
+            <w:tcMar>
+              <w:top w:type="dxa" w:w="60"/>
+              <w:left w:type="dxa" w:w="100"/>
+              <w:bottom w:type="dxa" w:w="60"/>
+              <w:right w:type="dxa" w:w="100"/>
+            </w:tcMar>
+          </w:tcPr>
+          <w:p>
+            <w:pPr>
+              <w:spacing w:line="276"/>
+            </w:pPr>
+            <w:r>
+              <w:rPr>
+                <w:rFonts w:ascii="Times New Roman" w:cs="Times New Roman" w:eastAsia="Times New Roman" w:hAnsi="Times New Roman"/>
+                <w:b w:val="false"/>
+                <w:bCs w:val="false"/>
+                <w:sz w:val="20"/>
+                <w:szCs w:val="20"/>
+              </w:rPr>
+              <w:t xml:space="preserve">310 tests and 20 browser tests, all passing</w:t>
+            </w:r>
+          </w:p>
+        </w:tc>
+        <w:tc>
+          <w:tcPr>
+            <w:tcW w:type="dxa" w:w="1902"/>
             <w:tcBorders>
               <w:top w:val="single" w:color="999999" w:sz="4"/>
               <w:left w:val="single" w:color="999999" w:sz="4"/>
@@ -2612,7 +2725,7 @@
         </w:trPr>
         <w:tc>
           <w:tcPr>
-            <w:tcW w:type="dxa" w:w="3312"/>
+            <w:tcW w:type="dxa" w:w="3562"/>
             <w:tcBorders>
               <w:top w:val="single" w:color="999999" w:sz="4"/>
               <w:left w:val="single" w:color="999999" w:sz="4"/>
@@ -2644,7 +2757,7 @@
         </w:tc>
         <w:tc>
           <w:tcPr>
-            <w:tcW w:type="dxa" w:w="3726"/>
+            <w:tcW w:type="dxa" w:w="3562"/>
             <w:tcBorders>
               <w:top w:val="single" w:color="999999" w:sz="4"/>
               <w:left w:val="single" w:color="999999" w:sz="4"/>
@@ -2676,7 +2789,7 @@
         </w:tc>
         <w:tc>
           <w:tcPr>
-            <w:tcW w:type="dxa" w:w="1988"/>
+            <w:tcW w:type="dxa" w:w="1902"/>
             <w:tcBorders>
               <w:top w:val="single" w:color="999999" w:sz="4"/>
               <w:left w:val="single" w:color="999999" w:sz="4"/>
@@ -2713,7 +2826,7 @@
         </w:trPr>
         <w:tc>
           <w:tcPr>
-            <w:tcW w:type="dxa" w:w="3312"/>
+            <w:tcW w:type="dxa" w:w="3562"/>
             <w:tcBorders>
               <w:top w:val="single" w:color="999999" w:sz="4"/>
               <w:left w:val="single" w:color="999999" w:sz="4"/>
@@ -2745,7 +2858,7 @@
         </w:tc>
         <w:tc>
           <w:tcPr>
-            <w:tcW w:type="dxa" w:w="3726"/>
+            <w:tcW w:type="dxa" w:w="3562"/>
             <w:tcBorders>
               <w:top w:val="single" w:color="999999" w:sz="4"/>
               <w:left w:val="single" w:color="999999" w:sz="4"/>
@@ -2777,7 +2890,7 @@
         </w:tc>
         <w:tc>
           <w:tcPr>
-            <w:tcW w:type="dxa" w:w="1988"/>
+            <w:tcW w:type="dxa" w:w="1902"/>
             <w:tcBorders>
               <w:top w:val="single" w:color="999999" w:sz="4"/>
               <w:left w:val="single" w:color="999999" w:sz="4"/>
@@ -2814,7 +2927,7 @@
         </w:trPr>
         <w:tc>
           <w:tcPr>
-            <w:tcW w:type="dxa" w:w="3312"/>
+            <w:tcW w:type="dxa" w:w="3562"/>
             <w:tcBorders>
               <w:top w:val="single" w:color="999999" w:sz="4"/>
               <w:left w:val="single" w:color="999999" w:sz="4"/>
@@ -2846,7 +2959,7 @@
         </w:tc>
         <w:tc>
           <w:tcPr>
-            <w:tcW w:type="dxa" w:w="3726"/>
+            <w:tcW w:type="dxa" w:w="3562"/>
             <w:tcBorders>
               <w:top w:val="single" w:color="999999" w:sz="4"/>
               <w:left w:val="single" w:color="999999" w:sz="4"/>
@@ -2878,7 +2991,7 @@
         </w:tc>
         <w:tc>
           <w:tcPr>
-            <w:tcW w:type="dxa" w:w="1988"/>
+            <w:tcW w:type="dxa" w:w="1902"/>
             <w:tcBorders>
               <w:top w:val="single" w:color="999999" w:sz="4"/>
               <w:left w:val="single" w:color="999999" w:sz="4"/>
@@ -2915,71 +3028,71 @@
         </w:trPr>
         <w:tc>
           <w:tcPr>
-            <w:tcW w:type="dxa" w:w="3312"/>
-            <w:tcBorders>
-              <w:top w:val="single" w:color="999999" w:sz="4"/>
-              <w:left w:val="single" w:color="999999" w:sz="4"/>
-              <w:bottom w:val="single" w:color="999999" w:sz="4"/>
-              <w:right w:val="single" w:color="999999" w:sz="4"/>
-            </w:tcBorders>
-            <w:tcMar>
-              <w:top w:type="dxa" w:w="60"/>
-              <w:left w:type="dxa" w:w="100"/>
-              <w:bottom w:type="dxa" w:w="60"/>
-              <w:right w:type="dxa" w:w="100"/>
-            </w:tcMar>
-          </w:tcPr>
-          <w:p>
-            <w:pPr>
-              <w:spacing w:line="276"/>
-            </w:pPr>
-            <w:r>
-              <w:rPr>
-                <w:rFonts w:ascii="Times New Roman" w:cs="Times New Roman" w:eastAsia="Times New Roman" w:hAnsi="Times New Roman"/>
-                <w:b w:val="false"/>
-                <w:bCs w:val="false"/>
-                <w:sz w:val="20"/>
-                <w:szCs w:val="20"/>
-              </w:rPr>
-              <w:t xml:space="preserve">Duplicate detection (precision / recall)</w:t>
-            </w:r>
-          </w:p>
-        </w:tc>
-        <w:tc>
-          <w:tcPr>
-            <w:tcW w:type="dxa" w:w="3726"/>
-            <w:tcBorders>
-              <w:top w:val="single" w:color="999999" w:sz="4"/>
-              <w:left w:val="single" w:color="999999" w:sz="4"/>
-              <w:bottom w:val="single" w:color="999999" w:sz="4"/>
-              <w:right w:val="single" w:color="999999" w:sz="4"/>
-            </w:tcBorders>
-            <w:tcMar>
-              <w:top w:type="dxa" w:w="60"/>
-              <w:left w:type="dxa" w:w="100"/>
-              <w:bottom w:type="dxa" w:w="60"/>
-              <w:right w:type="dxa" w:w="100"/>
-            </w:tcMar>
-          </w:tcPr>
-          <w:p>
-            <w:pPr>
-              <w:spacing w:line="276"/>
-            </w:pPr>
-            <w:r>
-              <w:rPr>
-                <w:rFonts w:ascii="Times New Roman" w:cs="Times New Roman" w:eastAsia="Times New Roman" w:hAnsi="Times New Roman"/>
-                <w:b w:val="false"/>
-                <w:bCs w:val="false"/>
-                <w:sz w:val="20"/>
-                <w:szCs w:val="20"/>
-              </w:rPr>
-              <w:t xml:space="preserve">1.000 / 1.000 at 1,000 records; 0.943 / 0.915 at 20,000; 0.775 / 0.920 at 100,000</w:t>
-            </w:r>
-          </w:p>
-        </w:tc>
-        <w:tc>
-          <w:tcPr>
-            <w:tcW w:type="dxa" w:w="1988"/>
+            <w:tcW w:type="dxa" w:w="3562"/>
+            <w:tcBorders>
+              <w:top w:val="single" w:color="999999" w:sz="4"/>
+              <w:left w:val="single" w:color="999999" w:sz="4"/>
+              <w:bottom w:val="single" w:color="999999" w:sz="4"/>
+              <w:right w:val="single" w:color="999999" w:sz="4"/>
+            </w:tcBorders>
+            <w:tcMar>
+              <w:top w:type="dxa" w:w="60"/>
+              <w:left w:type="dxa" w:w="100"/>
+              <w:bottom w:type="dxa" w:w="60"/>
+              <w:right w:type="dxa" w:w="100"/>
+            </w:tcMar>
+          </w:tcPr>
+          <w:p>
+            <w:pPr>
+              <w:spacing w:line="276"/>
+            </w:pPr>
+            <w:r>
+              <w:rPr>
+                <w:rFonts w:ascii="Times New Roman" w:cs="Times New Roman" w:eastAsia="Times New Roman" w:hAnsi="Times New Roman"/>
+                <w:b w:val="false"/>
+                <w:bCs w:val="false"/>
+                <w:sz w:val="20"/>
+                <w:szCs w:val="20"/>
+              </w:rPr>
+              <w:t xml:space="preserve">Duplicate detection after the stricter rule (precision / recall)</w:t>
+            </w:r>
+          </w:p>
+        </w:tc>
+        <w:tc>
+          <w:tcPr>
+            <w:tcW w:type="dxa" w:w="3562"/>
+            <w:tcBorders>
+              <w:top w:val="single" w:color="999999" w:sz="4"/>
+              <w:left w:val="single" w:color="999999" w:sz="4"/>
+              <w:bottom w:val="single" w:color="999999" w:sz="4"/>
+              <w:right w:val="single" w:color="999999" w:sz="4"/>
+            </w:tcBorders>
+            <w:tcMar>
+              <w:top w:type="dxa" w:w="60"/>
+              <w:left w:type="dxa" w:w="100"/>
+              <w:bottom w:type="dxa" w:w="60"/>
+              <w:right w:type="dxa" w:w="100"/>
+            </w:tcMar>
+          </w:tcPr>
+          <w:p>
+            <w:pPr>
+              <w:spacing w:line="276"/>
+            </w:pPr>
+            <w:r>
+              <w:rPr>
+                <w:rFonts w:ascii="Times New Roman" w:cs="Times New Roman" w:eastAsia="Times New Roman" w:hAnsi="Times New Roman"/>
+                <w:b w:val="false"/>
+                <w:bCs w:val="false"/>
+                <w:sz w:val="20"/>
+                <w:szCs w:val="20"/>
+              </w:rPr>
+              <w:t xml:space="preserve">1.000 / 1.000 at 1,000 records; 1.000 / 0.890 at 20,000; 0.998 / 0.883 at 100,000 (before: 0.943 / 0.915 and 0.775 / 0.920)</w:t>
+            </w:r>
+          </w:p>
+        </w:tc>
+        <w:tc>
+          <w:tcPr>
+            <w:tcW w:type="dxa" w:w="1902"/>
             <w:tcBorders>
               <w:top w:val="single" w:color="999999" w:sz="4"/>
               <w:left w:val="single" w:color="999999" w:sz="4"/>
@@ -3016,7 +3129,7 @@
         </w:trPr>
         <w:tc>
           <w:tcPr>
-            <w:tcW w:type="dxa" w:w="3312"/>
+            <w:tcW w:type="dxa" w:w="3562"/>
             <w:tcBorders>
               <w:top w:val="single" w:color="999999" w:sz="4"/>
               <w:left w:val="single" w:color="999999" w:sz="4"/>
@@ -3048,7 +3161,7 @@
         </w:tc>
         <w:tc>
           <w:tcPr>
-            <w:tcW w:type="dxa" w:w="3726"/>
+            <w:tcW w:type="dxa" w:w="3562"/>
             <w:tcBorders>
               <w:top w:val="single" w:color="999999" w:sz="4"/>
               <w:left w:val="single" w:color="999999" w:sz="4"/>
@@ -3080,7 +3193,7 @@
         </w:tc>
         <w:tc>
           <w:tcPr>
-            <w:tcW w:type="dxa" w:w="1988"/>
+            <w:tcW w:type="dxa" w:w="1902"/>
             <w:tcBorders>
               <w:top w:val="single" w:color="999999" w:sz="4"/>
               <w:left w:val="single" w:color="999999" w:sz="4"/>
@@ -3117,7 +3230,7 @@
         </w:trPr>
         <w:tc>
           <w:tcPr>
-            <w:tcW w:type="dxa" w:w="3312"/>
+            <w:tcW w:type="dxa" w:w="3562"/>
             <w:tcBorders>
               <w:top w:val="single" w:color="999999" w:sz="4"/>
               <w:left w:val="single" w:color="999999" w:sz="4"/>
@@ -3149,7 +3262,7 @@
         </w:tc>
         <w:tc>
           <w:tcPr>
-            <w:tcW w:type="dxa" w:w="3726"/>
+            <w:tcW w:type="dxa" w:w="3562"/>
             <w:tcBorders>
               <w:top w:val="single" w:color="999999" w:sz="4"/>
               <w:left w:val="single" w:color="999999" w:sz="4"/>
@@ -3181,7 +3294,7 @@
         </w:tc>
         <w:tc>
           <w:tcPr>
-            <w:tcW w:type="dxa" w:w="1988"/>
+            <w:tcW w:type="dxa" w:w="1902"/>
             <w:tcBorders>
               <w:top w:val="single" w:color="999999" w:sz="4"/>
               <w:left w:val="single" w:color="999999" w:sz="4"/>
@@ -3218,7 +3331,7 @@
         </w:trPr>
         <w:tc>
           <w:tcPr>
-            <w:tcW w:type="dxa" w:w="3312"/>
+            <w:tcW w:type="dxa" w:w="3562"/>
             <w:tcBorders>
               <w:top w:val="single" w:color="999999" w:sz="4"/>
               <w:left w:val="single" w:color="999999" w:sz="4"/>
@@ -3250,7 +3363,7 @@
         </w:tc>
         <w:tc>
           <w:tcPr>
-            <w:tcW w:type="dxa" w:w="3726"/>
+            <w:tcW w:type="dxa" w:w="3562"/>
             <w:tcBorders>
               <w:top w:val="single" w:color="999999" w:sz="4"/>
               <w:left w:val="single" w:color="999999" w:sz="4"/>
@@ -3282,7 +3395,7 @@
         </w:tc>
         <w:tc>
           <w:tcPr>
-            <w:tcW w:type="dxa" w:w="1988"/>
+            <w:tcW w:type="dxa" w:w="1902"/>
             <w:tcBorders>
               <w:top w:val="single" w:color="999999" w:sz="4"/>
               <w:left w:val="single" w:color="999999" w:sz="4"/>
@@ -3319,7 +3432,7 @@
         </w:trPr>
         <w:tc>
           <w:tcPr>
-            <w:tcW w:type="dxa" w:w="3312"/>
+            <w:tcW w:type="dxa" w:w="3562"/>
             <w:tcBorders>
               <w:top w:val="single" w:color="999999" w:sz="4"/>
               <w:left w:val="single" w:color="999999" w:sz="4"/>
@@ -3351,7 +3464,7 @@
         </w:tc>
         <w:tc>
           <w:tcPr>
-            <w:tcW w:type="dxa" w:w="3726"/>
+            <w:tcW w:type="dxa" w:w="3562"/>
             <w:tcBorders>
               <w:top w:val="single" w:color="999999" w:sz="4"/>
               <w:left w:val="single" w:color="999999" w:sz="4"/>
@@ -3383,7 +3496,7 @@
         </w:tc>
         <w:tc>
           <w:tcPr>
-            <w:tcW w:type="dxa" w:w="1988"/>
+            <w:tcW w:type="dxa" w:w="1902"/>
             <w:tcBorders>
               <w:top w:val="single" w:color="999999" w:sz="4"/>
               <w:left w:val="single" w:color="999999" w:sz="4"/>
@@ -3410,6 +3523,208 @@
                 <w:szCs w:val="20"/>
               </w:rPr>
               <w:t xml:space="preserve">No open critical or high</w:t>
+            </w:r>
+          </w:p>
+        </w:tc>
+      </w:tr>
+      <w:tr>
+        <w:trPr>
+          <w:tblHeader w:val="off"/>
+        </w:trPr>
+        <w:tc>
+          <w:tcPr>
+            <w:tcW w:type="dxa" w:w="3562"/>
+            <w:tcBorders>
+              <w:top w:val="single" w:color="999999" w:sz="4"/>
+              <w:left w:val="single" w:color="999999" w:sz="4"/>
+              <w:bottom w:val="single" w:color="999999" w:sz="4"/>
+              <w:right w:val="single" w:color="999999" w:sz="4"/>
+            </w:tcBorders>
+            <w:tcMar>
+              <w:top w:type="dxa" w:w="60"/>
+              <w:left w:type="dxa" w:w="100"/>
+              <w:bottom w:type="dxa" w:w="60"/>
+              <w:right w:type="dxa" w:w="100"/>
+            </w:tcMar>
+          </w:tcPr>
+          <w:p>
+            <w:pPr>
+              <w:spacing w:line="276"/>
+            </w:pPr>
+            <w:r>
+              <w:rPr>
+                <w:rFonts w:ascii="Times New Roman" w:cs="Times New Roman" w:eastAsia="Times New Roman" w:hAnsi="Times New Roman"/>
+                <w:b w:val="false"/>
+                <w:bCs w:val="false"/>
+                <w:sz w:val="20"/>
+                <w:szCs w:val="20"/>
+              </w:rPr>
+              <w:t xml:space="preserve">Accessibility (WCAG 2.1 AA, automated)</w:t>
+            </w:r>
+          </w:p>
+        </w:tc>
+        <w:tc>
+          <w:tcPr>
+            <w:tcW w:type="dxa" w:w="3562"/>
+            <w:tcBorders>
+              <w:top w:val="single" w:color="999999" w:sz="4"/>
+              <w:left w:val="single" w:color="999999" w:sz="4"/>
+              <w:bottom w:val="single" w:color="999999" w:sz="4"/>
+              <w:right w:val="single" w:color="999999" w:sz="4"/>
+            </w:tcBorders>
+            <w:tcMar>
+              <w:top w:type="dxa" w:w="60"/>
+              <w:left w:type="dxa" w:w="100"/>
+              <w:bottom w:type="dxa" w:w="60"/>
+              <w:right w:type="dxa" w:w="100"/>
+            </w:tcMar>
+          </w:tcPr>
+          <w:p>
+            <w:pPr>
+              <w:spacing w:line="276"/>
+            </w:pPr>
+            <w:r>
+              <w:rPr>
+                <w:rFonts w:ascii="Times New Roman" w:cs="Times New Roman" w:eastAsia="Times New Roman" w:hAnsi="Times New Roman"/>
+                <w:b w:val="false"/>
+                <w:bCs w:val="false"/>
+                <w:sz w:val="20"/>
+                <w:szCs w:val="20"/>
+              </w:rPr>
+              <w:t xml:space="preserve">No serious or critical issue on any page, light and dark themes, laptop and phone width, after fixing the contrast and keyboard problems the first scan found</w:t>
+            </w:r>
+          </w:p>
+        </w:tc>
+        <w:tc>
+          <w:tcPr>
+            <w:tcW w:type="dxa" w:w="1902"/>
+            <w:tcBorders>
+              <w:top w:val="single" w:color="999999" w:sz="4"/>
+              <w:left w:val="single" w:color="999999" w:sz="4"/>
+              <w:bottom w:val="single" w:color="999999" w:sz="4"/>
+              <w:right w:val="single" w:color="999999" w:sz="4"/>
+            </w:tcBorders>
+            <w:tcMar>
+              <w:top w:type="dxa" w:w="60"/>
+              <w:left w:type="dxa" w:w="100"/>
+              <w:bottom w:type="dxa" w:w="60"/>
+              <w:right w:type="dxa" w:w="100"/>
+            </w:tcMar>
+          </w:tcPr>
+          <w:p>
+            <w:pPr>
+              <w:spacing w:line="276"/>
+            </w:pPr>
+            <w:r>
+              <w:rPr>
+                <w:rFonts w:ascii="Times New Roman" w:cs="Times New Roman" w:eastAsia="Times New Roman" w:hAnsi="Times New Roman"/>
+                <w:b w:val="false"/>
+                <w:bCs w:val="false"/>
+                <w:sz w:val="20"/>
+                <w:szCs w:val="20"/>
+              </w:rPr>
+              <w:t xml:space="preserve">None</w:t>
+            </w:r>
+          </w:p>
+        </w:tc>
+      </w:tr>
+      <w:tr>
+        <w:trPr>
+          <w:tblHeader w:val="off"/>
+        </w:trPr>
+        <w:tc>
+          <w:tcPr>
+            <w:tcW w:type="dxa" w:w="3562"/>
+            <w:tcBorders>
+              <w:top w:val="single" w:color="999999" w:sz="4"/>
+              <w:left w:val="single" w:color="999999" w:sz="4"/>
+              <w:bottom w:val="single" w:color="999999" w:sz="4"/>
+              <w:right w:val="single" w:color="999999" w:sz="4"/>
+            </w:tcBorders>
+            <w:tcMar>
+              <w:top w:type="dxa" w:w="60"/>
+              <w:left w:type="dxa" w:w="100"/>
+              <w:bottom w:type="dxa" w:w="60"/>
+              <w:right w:type="dxa" w:w="100"/>
+            </w:tcMar>
+          </w:tcPr>
+          <w:p>
+            <w:pPr>
+              <w:spacing w:line="276"/>
+            </w:pPr>
+            <w:r>
+              <w:rPr>
+                <w:rFonts w:ascii="Times New Roman" w:cs="Times New Roman" w:eastAsia="Times New Roman" w:hAnsi="Times New Roman"/>
+                <w:b w:val="false"/>
+                <w:bCs w:val="false"/>
+                <w:sz w:val="20"/>
+                <w:szCs w:val="20"/>
+              </w:rPr>
+              <w:t xml:space="preserve">Backup and restore</w:t>
+            </w:r>
+          </w:p>
+        </w:tc>
+        <w:tc>
+          <w:tcPr>
+            <w:tcW w:type="dxa" w:w="3562"/>
+            <w:tcBorders>
+              <w:top w:val="single" w:color="999999" w:sz="4"/>
+              <w:left w:val="single" w:color="999999" w:sz="4"/>
+              <w:bottom w:val="single" w:color="999999" w:sz="4"/>
+              <w:right w:val="single" w:color="999999" w:sz="4"/>
+            </w:tcBorders>
+            <w:tcMar>
+              <w:top w:type="dxa" w:w="60"/>
+              <w:left w:type="dxa" w:w="100"/>
+              <w:bottom w:type="dxa" w:w="60"/>
+              <w:right w:type="dxa" w:w="100"/>
+            </w:tcMar>
+          </w:tcPr>
+          <w:p>
+            <w:pPr>
+              <w:spacing w:line="276"/>
+            </w:pPr>
+            <w:r>
+              <w:rPr>
+                <w:rFonts w:ascii="Times New Roman" w:cs="Times New Roman" w:eastAsia="Times New Roman" w:hAnsi="Times New Roman"/>
+                <w:b w:val="false"/>
+                <w:bCs w:val="false"/>
+                <w:sz w:val="20"/>
+                <w:szCs w:val="20"/>
+              </w:rPr>
+              <w:t xml:space="preserve">Restored copy matched the original in every table (the audit log differs by the backup's own entry)</w:t>
+            </w:r>
+          </w:p>
+        </w:tc>
+        <w:tc>
+          <w:tcPr>
+            <w:tcW w:type="dxa" w:w="1902"/>
+            <w:tcBorders>
+              <w:top w:val="single" w:color="999999" w:sz="4"/>
+              <w:left w:val="single" w:color="999999" w:sz="4"/>
+              <w:bottom w:val="single" w:color="999999" w:sz="4"/>
+              <w:right w:val="single" w:color="999999" w:sz="4"/>
+            </w:tcBorders>
+            <w:tcMar>
+              <w:top w:type="dxa" w:w="60"/>
+              <w:left w:type="dxa" w:w="100"/>
+              <w:bottom w:type="dxa" w:w="60"/>
+              <w:right w:type="dxa" w:w="100"/>
+            </w:tcMar>
+          </w:tcPr>
+          <w:p>
+            <w:pPr>
+              <w:spacing w:line="276"/>
+            </w:pPr>
+            <w:r>
+              <w:rPr>
+                <w:rFonts w:ascii="Times New Roman" w:cs="Times New Roman" w:eastAsia="Times New Roman" w:hAnsi="Times New Roman"/>
+                <w:b w:val="false"/>
+                <w:bCs w:val="false"/>
+                <w:sz w:val="20"/>
+                <w:szCs w:val="20"/>
+              </w:rPr>
+              <w:t xml:space="preserve">Tested once</w:t>
             </w:r>
           </w:p>
         </w:tc>
@@ -3433,7 +3748,7 @@
           <w:sz w:val="24"/>
           <w:szCs w:val="24"/>
         </w:rPr>
-        <w:t xml:space="preserve">One target was missed: duplicate precision drops to 0.775 at 100,000 records, because many different incidents of the same type in the same ward within two hours share similar landmark text in the sample data. I have kept the target unchanged and recorded two options: keep the rule and report the limitation, or also compare house or plot numbers.</w:t>
+        <w:t xml:space="preserve">In the first evaluation duplicate precision fell to 0.775 at 100,000 records, because different incidents of the same type in the same ward within two hours often share a landmark in the sample data. I decided to also require any house or plot numbers in the two locations to match. Precision is now 0.998, but recall falls just below the target (0.890 and 0.883 at the larger sizes), because some planted copies retype the number. I have kept the target unchanged and report both results as measured.</w:t>
       </w:r>
     </w:p>
     <w:p>
@@ -3486,9 +3801,9 @@
         </w:tblBorders>
       </w:tblPr>
       <w:tblGrid>
-        <w:gridCol w:w="2664"/>
-        <w:gridCol w:w="3868"/>
-        <w:gridCol w:w="2494"/>
+        <w:gridCol w:w="2976"/>
+        <w:gridCol w:w="4320"/>
+        <w:gridCol w:w="1730"/>
       </w:tblGrid>
       <w:tr>
         <w:trPr>
@@ -3496,7 +3811,7 @@
         </w:trPr>
         <w:tc>
           <w:tcPr>
-            <w:tcW w:type="dxa" w:w="2664"/>
+            <w:tcW w:type="dxa" w:w="2976"/>
             <w:tcBorders>
               <w:top w:val="single" w:color="999999" w:sz="4"/>
               <w:left w:val="single" w:color="999999" w:sz="4"/>
@@ -3529,7 +3844,7 @@
         </w:tc>
         <w:tc>
           <w:tcPr>
-            <w:tcW w:type="dxa" w:w="3868"/>
+            <w:tcW w:type="dxa" w:w="4320"/>
             <w:tcBorders>
               <w:top w:val="single" w:color="999999" w:sz="4"/>
               <w:left w:val="single" w:color="999999" w:sz="4"/>
@@ -3562,7 +3877,7 @@
         </w:tc>
         <w:tc>
           <w:tcPr>
-            <w:tcW w:type="dxa" w:w="2494"/>
+            <w:tcW w:type="dxa" w:w="1730"/>
             <w:tcBorders>
               <w:top w:val="single" w:color="999999" w:sz="4"/>
               <w:left w:val="single" w:color="999999" w:sz="4"/>
@@ -3600,97 +3915,97 @@
         </w:trPr>
         <w:tc>
           <w:tcPr>
-            <w:tcW w:type="dxa" w:w="2664"/>
-            <w:tcBorders>
-              <w:top w:val="single" w:color="999999" w:sz="4"/>
-              <w:left w:val="single" w:color="999999" w:sz="4"/>
-              <w:bottom w:val="single" w:color="999999" w:sz="4"/>
-              <w:right w:val="single" w:color="999999" w:sz="4"/>
-            </w:tcBorders>
-            <w:tcMar>
-              <w:top w:type="dxa" w:w="60"/>
-              <w:left w:type="dxa" w:w="100"/>
-              <w:bottom w:type="dxa" w:w="60"/>
-              <w:right w:type="dxa" w:w="100"/>
-            </w:tcMar>
-          </w:tcPr>
-          <w:p>
-            <w:pPr>
-              <w:spacing w:line="276"/>
-            </w:pPr>
-            <w:r>
-              <w:rPr>
-                <w:rFonts w:ascii="Times New Roman" w:cs="Times New Roman" w:eastAsia="Times New Roman" w:hAnsi="Times New Roman"/>
-                <w:b w:val="false"/>
-                <w:bCs w:val="false"/>
-                <w:sz w:val="20"/>
-                <w:szCs w:val="20"/>
-              </w:rPr>
-              <w:t xml:space="preserve">Duplicate rule at high volume</w:t>
-            </w:r>
-          </w:p>
-        </w:tc>
-        <w:tc>
-          <w:tcPr>
-            <w:tcW w:type="dxa" w:w="3868"/>
-            <w:tcBorders>
-              <w:top w:val="single" w:color="999999" w:sz="4"/>
-              <w:left w:val="single" w:color="999999" w:sz="4"/>
-              <w:bottom w:val="single" w:color="999999" w:sz="4"/>
-              <w:right w:val="single" w:color="999999" w:sz="4"/>
-            </w:tcBorders>
-            <w:tcMar>
-              <w:top w:type="dxa" w:w="60"/>
-              <w:left w:type="dxa" w:w="100"/>
-              <w:bottom w:type="dxa" w:w="60"/>
-              <w:right w:type="dxa" w:w="100"/>
-            </w:tcMar>
-          </w:tcPr>
-          <w:p>
-            <w:pPr>
-              <w:spacing w:line="276"/>
-            </w:pPr>
-            <w:r>
-              <w:rPr>
-                <w:rFonts w:ascii="Times New Roman" w:cs="Times New Roman" w:eastAsia="Times New Roman" w:hAnsi="Times New Roman"/>
-                <w:b w:val="false"/>
-                <w:bCs w:val="false"/>
-                <w:sz w:val="20"/>
-                <w:szCs w:val="20"/>
-              </w:rPr>
-              <w:t xml:space="preserve">Decide whether to add a house or plot number check to the duplicate rule, then implement and re-measure</w:t>
-            </w:r>
-          </w:p>
-        </w:tc>
-        <w:tc>
-          <w:tcPr>
-            <w:tcW w:type="dxa" w:w="2494"/>
-            <w:tcBorders>
-              <w:top w:val="single" w:color="999999" w:sz="4"/>
-              <w:left w:val="single" w:color="999999" w:sz="4"/>
-              <w:bottom w:val="single" w:color="999999" w:sz="4"/>
-              <w:right w:val="single" w:color="999999" w:sz="4"/>
-            </w:tcBorders>
-            <w:tcMar>
-              <w:top w:type="dxa" w:w="60"/>
-              <w:left w:type="dxa" w:w="100"/>
-              <w:bottom w:type="dxa" w:w="60"/>
-              <w:right w:type="dxa" w:w="100"/>
-            </w:tcMar>
-          </w:tcPr>
-          <w:p>
-            <w:pPr>
-              <w:spacing w:line="276"/>
-            </w:pPr>
-            <w:r>
-              <w:rPr>
-                <w:rFonts w:ascii="Times New Roman" w:cs="Times New Roman" w:eastAsia="Times New Roman" w:hAnsi="Times New Roman"/>
-                <w:b w:val="false"/>
-                <w:bCs w:val="false"/>
-                <w:sz w:val="20"/>
-                <w:szCs w:val="20"/>
-              </w:rPr>
-              <w:t xml:space="preserve">My decision, with your advice</w:t>
+            <w:tcW w:type="dxa" w:w="2976"/>
+            <w:tcBorders>
+              <w:top w:val="single" w:color="999999" w:sz="4"/>
+              <w:left w:val="single" w:color="999999" w:sz="4"/>
+              <w:bottom w:val="single" w:color="999999" w:sz="4"/>
+              <w:right w:val="single" w:color="999999" w:sz="4"/>
+            </w:tcBorders>
+            <w:tcMar>
+              <w:top w:type="dxa" w:w="60"/>
+              <w:left w:type="dxa" w:w="100"/>
+              <w:bottom w:type="dxa" w:w="60"/>
+              <w:right w:type="dxa" w:w="100"/>
+            </w:tcMar>
+          </w:tcPr>
+          <w:p>
+            <w:pPr>
+              <w:spacing w:line="276"/>
+            </w:pPr>
+            <w:r>
+              <w:rPr>
+                <w:rFonts w:ascii="Times New Roman" w:cs="Times New Roman" w:eastAsia="Times New Roman" w:hAnsi="Times New Roman"/>
+                <w:b w:val="false"/>
+                <w:bCs w:val="false"/>
+                <w:sz w:val="20"/>
+                <w:szCs w:val="20"/>
+              </w:rPr>
+              <w:t xml:space="preserve">Ward and sub-county list</w:t>
+            </w:r>
+          </w:p>
+        </w:tc>
+        <w:tc>
+          <w:tcPr>
+            <w:tcW w:type="dxa" w:w="4320"/>
+            <w:tcBorders>
+              <w:top w:val="single" w:color="999999" w:sz="4"/>
+              <w:left w:val="single" w:color="999999" w:sz="4"/>
+              <w:bottom w:val="single" w:color="999999" w:sz="4"/>
+              <w:right w:val="single" w:color="999999" w:sz="4"/>
+            </w:tcBorders>
+            <w:tcMar>
+              <w:top w:type="dxa" w:w="60"/>
+              <w:left w:type="dxa" w:w="100"/>
+              <w:bottom w:type="dxa" w:w="60"/>
+              <w:right w:type="dxa" w:w="100"/>
+            </w:tcMar>
+          </w:tcPr>
+          <w:p>
+            <w:pPr>
+              <w:spacing w:line="276"/>
+            </w:pPr>
+            <w:r>
+              <w:rPr>
+                <w:rFonts w:ascii="Times New Roman" w:cs="Times New Roman" w:eastAsia="Times New Roman" w:hAnsi="Times New Roman"/>
+                <w:b w:val="false"/>
+                <w:bCs w:val="false"/>
+                <w:sz w:val="20"/>
+                <w:szCs w:val="20"/>
+              </w:rPr>
+              <w:t xml:space="preserve">Check the 85 wards and 17 sub-counties against the official IEBC list and correct any differences</w:t>
+            </w:r>
+          </w:p>
+        </w:tc>
+        <w:tc>
+          <w:tcPr>
+            <w:tcW w:type="dxa" w:w="1730"/>
+            <w:tcBorders>
+              <w:top w:val="single" w:color="999999" w:sz="4"/>
+              <w:left w:val="single" w:color="999999" w:sz="4"/>
+              <w:bottom w:val="single" w:color="999999" w:sz="4"/>
+              <w:right w:val="single" w:color="999999" w:sz="4"/>
+            </w:tcBorders>
+            <w:tcMar>
+              <w:top w:type="dxa" w:w="60"/>
+              <w:left w:type="dxa" w:w="100"/>
+              <w:bottom w:type="dxa" w:w="60"/>
+              <w:right w:type="dxa" w:w="100"/>
+            </w:tcMar>
+          </w:tcPr>
+          <w:p>
+            <w:pPr>
+              <w:spacing w:line="276"/>
+            </w:pPr>
+            <w:r>
+              <w:rPr>
+                <w:rFonts w:ascii="Times New Roman" w:cs="Times New Roman" w:eastAsia="Times New Roman" w:hAnsi="Times New Roman"/>
+                <w:b w:val="false"/>
+                <w:bCs w:val="false"/>
+                <w:sz w:val="20"/>
+                <w:szCs w:val="20"/>
+              </w:rPr>
+              <w:t xml:space="preserve">Official source</w:t>
             </w:r>
           </w:p>
         </w:tc>
@@ -3701,97 +4016,97 @@
         </w:trPr>
         <w:tc>
           <w:tcPr>
-            <w:tcW w:type="dxa" w:w="2664"/>
-            <w:tcBorders>
-              <w:top w:val="single" w:color="999999" w:sz="4"/>
-              <w:left w:val="single" w:color="999999" w:sz="4"/>
-              <w:bottom w:val="single" w:color="999999" w:sz="4"/>
-              <w:right w:val="single" w:color="999999" w:sz="4"/>
-            </w:tcBorders>
-            <w:tcMar>
-              <w:top w:type="dxa" w:w="60"/>
-              <w:left w:type="dxa" w:w="100"/>
-              <w:bottom w:type="dxa" w:w="60"/>
-              <w:right w:type="dxa" w:w="100"/>
-            </w:tcMar>
-          </w:tcPr>
-          <w:p>
-            <w:pPr>
-              <w:spacing w:line="276"/>
-            </w:pPr>
-            <w:r>
-              <w:rPr>
-                <w:rFonts w:ascii="Times New Roman" w:cs="Times New Roman" w:eastAsia="Times New Roman" w:hAnsi="Times New Roman"/>
-                <w:b w:val="false"/>
-                <w:bCs w:val="false"/>
-                <w:sz w:val="20"/>
-                <w:szCs w:val="20"/>
-              </w:rPr>
-              <w:t xml:space="preserve">Two access-rule decisions</w:t>
-            </w:r>
-          </w:p>
-        </w:tc>
-        <w:tc>
-          <w:tcPr>
-            <w:tcW w:type="dxa" w:w="3868"/>
-            <w:tcBorders>
-              <w:top w:val="single" w:color="999999" w:sz="4"/>
-              <w:left w:val="single" w:color="999999" w:sz="4"/>
-              <w:bottom w:val="single" w:color="999999" w:sz="4"/>
-              <w:right w:val="single" w:color="999999" w:sz="4"/>
-            </w:tcBorders>
-            <w:tcMar>
-              <w:top w:type="dxa" w:w="60"/>
-              <w:left w:type="dxa" w:w="100"/>
-              <w:bottom w:type="dxa" w:w="60"/>
-              <w:right w:type="dxa" w:w="100"/>
-            </w:tcMar>
-          </w:tcPr>
-          <w:p>
-            <w:pPr>
-              <w:spacing w:line="276"/>
-            </w:pPr>
-            <w:r>
-              <w:rPr>
-                <w:rFonts w:ascii="Times New Roman" w:cs="Times New Roman" w:eastAsia="Times New Roman" w:hAnsi="Times New Roman"/>
-                <w:b w:val="false"/>
-                <w:bCs w:val="false"/>
-                <w:sz w:val="20"/>
-                <w:szCs w:val="20"/>
-              </w:rPr>
-              <w:t xml:space="preserve">Confirm who may change an incident's status, and how hotspots are compared in an officer's station view</w:t>
-            </w:r>
-          </w:p>
-        </w:tc>
-        <w:tc>
-          <w:tcPr>
-            <w:tcW w:type="dxa" w:w="2494"/>
-            <w:tcBorders>
-              <w:top w:val="single" w:color="999999" w:sz="4"/>
-              <w:left w:val="single" w:color="999999" w:sz="4"/>
-              <w:bottom w:val="single" w:color="999999" w:sz="4"/>
-              <w:right w:val="single" w:color="999999" w:sz="4"/>
-            </w:tcBorders>
-            <w:tcMar>
-              <w:top w:type="dxa" w:w="60"/>
-              <w:left w:type="dxa" w:w="100"/>
-              <w:bottom w:type="dxa" w:w="60"/>
-              <w:right w:type="dxa" w:w="100"/>
-            </w:tcMar>
-          </w:tcPr>
-          <w:p>
-            <w:pPr>
-              <w:spacing w:line="276"/>
-            </w:pPr>
-            <w:r>
-              <w:rPr>
-                <w:rFonts w:ascii="Times New Roman" w:cs="Times New Roman" w:eastAsia="Times New Roman" w:hAnsi="Times New Roman"/>
-                <w:b w:val="false"/>
-                <w:bCs w:val="false"/>
-                <w:sz w:val="20"/>
-                <w:szCs w:val="20"/>
-              </w:rPr>
-              <w:t xml:space="preserve">My decision</w:t>
+            <w:tcW w:type="dxa" w:w="2976"/>
+            <w:tcBorders>
+              <w:top w:val="single" w:color="999999" w:sz="4"/>
+              <w:left w:val="single" w:color="999999" w:sz="4"/>
+              <w:bottom w:val="single" w:color="999999" w:sz="4"/>
+              <w:right w:val="single" w:color="999999" w:sz="4"/>
+            </w:tcBorders>
+            <w:tcMar>
+              <w:top w:type="dxa" w:w="60"/>
+              <w:left w:type="dxa" w:w="100"/>
+              <w:bottom w:type="dxa" w:w="60"/>
+              <w:right w:type="dxa" w:w="100"/>
+            </w:tcMar>
+          </w:tcPr>
+          <w:p>
+            <w:pPr>
+              <w:spacing w:line="276"/>
+            </w:pPr>
+            <w:r>
+              <w:rPr>
+                <w:rFonts w:ascii="Times New Roman" w:cs="Times New Roman" w:eastAsia="Times New Roman" w:hAnsi="Times New Roman"/>
+                <w:b w:val="false"/>
+                <w:bCs w:val="false"/>
+                <w:sz w:val="20"/>
+                <w:szCs w:val="20"/>
+              </w:rPr>
+              <w:t xml:space="preserve">Changes from fieldwork</w:t>
+            </w:r>
+          </w:p>
+        </w:tc>
+        <w:tc>
+          <w:tcPr>
+            <w:tcW w:type="dxa" w:w="4320"/>
+            <w:tcBorders>
+              <w:top w:val="single" w:color="999999" w:sz="4"/>
+              <w:left w:val="single" w:color="999999" w:sz="4"/>
+              <w:bottom w:val="single" w:color="999999" w:sz="4"/>
+              <w:right w:val="single" w:color="999999" w:sz="4"/>
+            </w:tcBorders>
+            <w:tcMar>
+              <w:top w:type="dxa" w:w="60"/>
+              <w:left w:type="dxa" w:w="100"/>
+              <w:bottom w:type="dxa" w:w="60"/>
+              <w:right w:type="dxa" w:w="100"/>
+            </w:tcMar>
+          </w:tcPr>
+          <w:p>
+            <w:pPr>
+              <w:spacing w:line="276"/>
+            </w:pPr>
+            <w:r>
+              <w:rPr>
+                <w:rFonts w:ascii="Times New Roman" w:cs="Times New Roman" w:eastAsia="Times New Roman" w:hAnsi="Times New Roman"/>
+                <w:b w:val="false"/>
+                <w:bCs w:val="false"/>
+                <w:sz w:val="20"/>
+                <w:szCs w:val="20"/>
+              </w:rPr>
+              <w:t xml:space="preserve">Apply requirement changes that come out of the interviews and questionnaire</w:t>
+            </w:r>
+          </w:p>
+        </w:tc>
+        <w:tc>
+          <w:tcPr>
+            <w:tcW w:type="dxa" w:w="1730"/>
+            <w:tcBorders>
+              <w:top w:val="single" w:color="999999" w:sz="4"/>
+              <w:left w:val="single" w:color="999999" w:sz="4"/>
+              <w:bottom w:val="single" w:color="999999" w:sz="4"/>
+              <w:right w:val="single" w:color="999999" w:sz="4"/>
+            </w:tcBorders>
+            <w:tcMar>
+              <w:top w:type="dxa" w:w="60"/>
+              <w:left w:type="dxa" w:w="100"/>
+              <w:bottom w:type="dxa" w:w="60"/>
+              <w:right w:type="dxa" w:w="100"/>
+            </w:tcMar>
+          </w:tcPr>
+          <w:p>
+            <w:pPr>
+              <w:spacing w:line="276"/>
+            </w:pPr>
+            <w:r>
+              <w:rPr>
+                <w:rFonts w:ascii="Times New Roman" w:cs="Times New Roman" w:eastAsia="Times New Roman" w:hAnsi="Times New Roman"/>
+                <w:b w:val="false"/>
+                <w:bCs w:val="false"/>
+                <w:sz w:val="20"/>
+                <w:szCs w:val="20"/>
+              </w:rPr>
+              <w:t xml:space="preserve">Fieldwork</w:t>
             </w:r>
           </w:p>
         </w:tc>
@@ -3802,97 +4117,97 @@
         </w:trPr>
         <w:tc>
           <w:tcPr>
-            <w:tcW w:type="dxa" w:w="2664"/>
-            <w:tcBorders>
-              <w:top w:val="single" w:color="999999" w:sz="4"/>
-              <w:left w:val="single" w:color="999999" w:sz="4"/>
-              <w:bottom w:val="single" w:color="999999" w:sz="4"/>
-              <w:right w:val="single" w:color="999999" w:sz="4"/>
-            </w:tcBorders>
-            <w:tcMar>
-              <w:top w:type="dxa" w:w="60"/>
-              <w:left w:type="dxa" w:w="100"/>
-              <w:bottom w:type="dxa" w:w="60"/>
-              <w:right w:type="dxa" w:w="100"/>
-            </w:tcMar>
-          </w:tcPr>
-          <w:p>
-            <w:pPr>
-              <w:spacing w:line="276"/>
-            </w:pPr>
-            <w:r>
-              <w:rPr>
-                <w:rFonts w:ascii="Times New Roman" w:cs="Times New Roman" w:eastAsia="Times New Roman" w:hAnsi="Times New Roman"/>
-                <w:b w:val="false"/>
-                <w:bCs w:val="false"/>
-                <w:sz w:val="20"/>
-                <w:szCs w:val="20"/>
-              </w:rPr>
-              <w:t xml:space="preserve">Ward and sub-county list</w:t>
-            </w:r>
-          </w:p>
-        </w:tc>
-        <w:tc>
-          <w:tcPr>
-            <w:tcW w:type="dxa" w:w="3868"/>
-            <w:tcBorders>
-              <w:top w:val="single" w:color="999999" w:sz="4"/>
-              <w:left w:val="single" w:color="999999" w:sz="4"/>
-              <w:bottom w:val="single" w:color="999999" w:sz="4"/>
-              <w:right w:val="single" w:color="999999" w:sz="4"/>
-            </w:tcBorders>
-            <w:tcMar>
-              <w:top w:type="dxa" w:w="60"/>
-              <w:left w:type="dxa" w:w="100"/>
-              <w:bottom w:type="dxa" w:w="60"/>
-              <w:right w:type="dxa" w:w="100"/>
-            </w:tcMar>
-          </w:tcPr>
-          <w:p>
-            <w:pPr>
-              <w:spacing w:line="276"/>
-            </w:pPr>
-            <w:r>
-              <w:rPr>
-                <w:rFonts w:ascii="Times New Roman" w:cs="Times New Roman" w:eastAsia="Times New Roman" w:hAnsi="Times New Roman"/>
-                <w:b w:val="false"/>
-                <w:bCs w:val="false"/>
-                <w:sz w:val="20"/>
-                <w:szCs w:val="20"/>
-              </w:rPr>
-              <w:t xml:space="preserve">Check the 85 wards and 17 sub-counties against the official IEBC list and correct any differences</w:t>
-            </w:r>
-          </w:p>
-        </w:tc>
-        <w:tc>
-          <w:tcPr>
-            <w:tcW w:type="dxa" w:w="2494"/>
-            <w:tcBorders>
-              <w:top w:val="single" w:color="999999" w:sz="4"/>
-              <w:left w:val="single" w:color="999999" w:sz="4"/>
-              <w:bottom w:val="single" w:color="999999" w:sz="4"/>
-              <w:right w:val="single" w:color="999999" w:sz="4"/>
-            </w:tcBorders>
-            <w:tcMar>
-              <w:top w:type="dxa" w:w="60"/>
-              <w:left w:type="dxa" w:w="100"/>
-              <w:bottom w:type="dxa" w:w="60"/>
-              <w:right w:type="dxa" w:w="100"/>
-            </w:tcMar>
-          </w:tcPr>
-          <w:p>
-            <w:pPr>
-              <w:spacing w:line="276"/>
-            </w:pPr>
-            <w:r>
-              <w:rPr>
-                <w:rFonts w:ascii="Times New Roman" w:cs="Times New Roman" w:eastAsia="Times New Roman" w:hAnsi="Times New Roman"/>
-                <w:b w:val="false"/>
-                <w:bCs w:val="false"/>
-                <w:sz w:val="20"/>
-                <w:szCs w:val="20"/>
-              </w:rPr>
-              <w:t xml:space="preserve">Official source</w:t>
+            <w:tcW w:type="dxa" w:w="2976"/>
+            <w:tcBorders>
+              <w:top w:val="single" w:color="999999" w:sz="4"/>
+              <w:left w:val="single" w:color="999999" w:sz="4"/>
+              <w:bottom w:val="single" w:color="999999" w:sz="4"/>
+              <w:right w:val="single" w:color="999999" w:sz="4"/>
+            </w:tcBorders>
+            <w:tcMar>
+              <w:top w:type="dxa" w:w="60"/>
+              <w:left w:type="dxa" w:w="100"/>
+              <w:bottom w:type="dxa" w:w="60"/>
+              <w:right w:type="dxa" w:w="100"/>
+            </w:tcMar>
+          </w:tcPr>
+          <w:p>
+            <w:pPr>
+              <w:spacing w:line="276"/>
+            </w:pPr>
+            <w:r>
+              <w:rPr>
+                <w:rFonts w:ascii="Times New Roman" w:cs="Times New Roman" w:eastAsia="Times New Roman" w:hAnsi="Times New Roman"/>
+                <w:b w:val="false"/>
+                <w:bCs w:val="false"/>
+                <w:sz w:val="20"/>
+                <w:szCs w:val="20"/>
+              </w:rPr>
+              <w:t xml:space="preserve">Changes from usability sessions</w:t>
+            </w:r>
+          </w:p>
+        </w:tc>
+        <w:tc>
+          <w:tcPr>
+            <w:tcW w:type="dxa" w:w="4320"/>
+            <w:tcBorders>
+              <w:top w:val="single" w:color="999999" w:sz="4"/>
+              <w:left w:val="single" w:color="999999" w:sz="4"/>
+              <w:bottom w:val="single" w:color="999999" w:sz="4"/>
+              <w:right w:val="single" w:color="999999" w:sz="4"/>
+            </w:tcBorders>
+            <w:tcMar>
+              <w:top w:type="dxa" w:w="60"/>
+              <w:left w:type="dxa" w:w="100"/>
+              <w:bottom w:type="dxa" w:w="60"/>
+              <w:right w:type="dxa" w:w="100"/>
+            </w:tcMar>
+          </w:tcPr>
+          <w:p>
+            <w:pPr>
+              <w:spacing w:line="276"/>
+            </w:pPr>
+            <w:r>
+              <w:rPr>
+                <w:rFonts w:ascii="Times New Roman" w:cs="Times New Roman" w:eastAsia="Times New Roman" w:hAnsi="Times New Roman"/>
+                <w:b w:val="false"/>
+                <w:bCs w:val="false"/>
+                <w:sz w:val="20"/>
+                <w:szCs w:val="20"/>
+              </w:rPr>
+              <w:t xml:space="preserve">Fix problems found by real users, then re-test the affected tasks</w:t>
+            </w:r>
+          </w:p>
+        </w:tc>
+        <w:tc>
+          <w:tcPr>
+            <w:tcW w:type="dxa" w:w="1730"/>
+            <w:tcBorders>
+              <w:top w:val="single" w:color="999999" w:sz="4"/>
+              <w:left w:val="single" w:color="999999" w:sz="4"/>
+              <w:bottom w:val="single" w:color="999999" w:sz="4"/>
+              <w:right w:val="single" w:color="999999" w:sz="4"/>
+            </w:tcBorders>
+            <w:tcMar>
+              <w:top w:type="dxa" w:w="60"/>
+              <w:left w:type="dxa" w:w="100"/>
+              <w:bottom w:type="dxa" w:w="60"/>
+              <w:right w:type="dxa" w:w="100"/>
+            </w:tcMar>
+          </w:tcPr>
+          <w:p>
+            <w:pPr>
+              <w:spacing w:line="276"/>
+            </w:pPr>
+            <w:r>
+              <w:rPr>
+                <w:rFonts w:ascii="Times New Roman" w:cs="Times New Roman" w:eastAsia="Times New Roman" w:hAnsi="Times New Roman"/>
+                <w:b w:val="false"/>
+                <w:bCs w:val="false"/>
+                <w:sz w:val="20"/>
+                <w:szCs w:val="20"/>
+              </w:rPr>
+              <w:t xml:space="preserve">Usability sessions</w:t>
             </w:r>
           </w:p>
         </w:tc>
@@ -3903,97 +4218,97 @@
         </w:trPr>
         <w:tc>
           <w:tcPr>
-            <w:tcW w:type="dxa" w:w="2664"/>
-            <w:tcBorders>
-              <w:top w:val="single" w:color="999999" w:sz="4"/>
-              <w:left w:val="single" w:color="999999" w:sz="4"/>
-              <w:bottom w:val="single" w:color="999999" w:sz="4"/>
-              <w:right w:val="single" w:color="999999" w:sz="4"/>
-            </w:tcBorders>
-            <w:tcMar>
-              <w:top w:type="dxa" w:w="60"/>
-              <w:left w:type="dxa" w:w="100"/>
-              <w:bottom w:type="dxa" w:w="60"/>
-              <w:right w:type="dxa" w:w="100"/>
-            </w:tcMar>
-          </w:tcPr>
-          <w:p>
-            <w:pPr>
-              <w:spacing w:line="276"/>
-            </w:pPr>
-            <w:r>
-              <w:rPr>
-                <w:rFonts w:ascii="Times New Roman" w:cs="Times New Roman" w:eastAsia="Times New Roman" w:hAnsi="Times New Roman"/>
-                <w:b w:val="false"/>
-                <w:bCs w:val="false"/>
-                <w:sz w:val="20"/>
-                <w:szCs w:val="20"/>
-              </w:rPr>
-              <w:t xml:space="preserve">Changes from fieldwork</w:t>
-            </w:r>
-          </w:p>
-        </w:tc>
-        <w:tc>
-          <w:tcPr>
-            <w:tcW w:type="dxa" w:w="3868"/>
-            <w:tcBorders>
-              <w:top w:val="single" w:color="999999" w:sz="4"/>
-              <w:left w:val="single" w:color="999999" w:sz="4"/>
-              <w:bottom w:val="single" w:color="999999" w:sz="4"/>
-              <w:right w:val="single" w:color="999999" w:sz="4"/>
-            </w:tcBorders>
-            <w:tcMar>
-              <w:top w:type="dxa" w:w="60"/>
-              <w:left w:type="dxa" w:w="100"/>
-              <w:bottom w:type="dxa" w:w="60"/>
-              <w:right w:type="dxa" w:w="100"/>
-            </w:tcMar>
-          </w:tcPr>
-          <w:p>
-            <w:pPr>
-              <w:spacing w:line="276"/>
-            </w:pPr>
-            <w:r>
-              <w:rPr>
-                <w:rFonts w:ascii="Times New Roman" w:cs="Times New Roman" w:eastAsia="Times New Roman" w:hAnsi="Times New Roman"/>
-                <w:b w:val="false"/>
-                <w:bCs w:val="false"/>
-                <w:sz w:val="20"/>
-                <w:szCs w:val="20"/>
-              </w:rPr>
-              <w:t xml:space="preserve">Apply requirement changes that come out of the interviews and questionnaire</w:t>
-            </w:r>
-          </w:p>
-        </w:tc>
-        <w:tc>
-          <w:tcPr>
-            <w:tcW w:type="dxa" w:w="2494"/>
-            <w:tcBorders>
-              <w:top w:val="single" w:color="999999" w:sz="4"/>
-              <w:left w:val="single" w:color="999999" w:sz="4"/>
-              <w:bottom w:val="single" w:color="999999" w:sz="4"/>
-              <w:right w:val="single" w:color="999999" w:sz="4"/>
-            </w:tcBorders>
-            <w:tcMar>
-              <w:top w:type="dxa" w:w="60"/>
-              <w:left w:type="dxa" w:w="100"/>
-              <w:bottom w:type="dxa" w:w="60"/>
-              <w:right w:type="dxa" w:w="100"/>
-            </w:tcMar>
-          </w:tcPr>
-          <w:p>
-            <w:pPr>
-              <w:spacing w:line="276"/>
-            </w:pPr>
-            <w:r>
-              <w:rPr>
-                <w:rFonts w:ascii="Times New Roman" w:cs="Times New Roman" w:eastAsia="Times New Roman" w:hAnsi="Times New Roman"/>
-                <w:b w:val="false"/>
-                <w:bCs w:val="false"/>
-                <w:sz w:val="20"/>
-                <w:szCs w:val="20"/>
-              </w:rPr>
-              <w:t xml:space="preserve">Fieldwork</w:t>
+            <w:tcW w:type="dxa" w:w="2976"/>
+            <w:tcBorders>
+              <w:top w:val="single" w:color="999999" w:sz="4"/>
+              <w:left w:val="single" w:color="999999" w:sz="4"/>
+              <w:bottom w:val="single" w:color="999999" w:sz="4"/>
+              <w:right w:val="single" w:color="999999" w:sz="4"/>
+            </w:tcBorders>
+            <w:tcMar>
+              <w:top w:type="dxa" w:w="60"/>
+              <w:left w:type="dxa" w:w="100"/>
+              <w:bottom w:type="dxa" w:w="60"/>
+              <w:right w:type="dxa" w:w="100"/>
+            </w:tcMar>
+          </w:tcPr>
+          <w:p>
+            <w:pPr>
+              <w:spacing w:line="276"/>
+            </w:pPr>
+            <w:r>
+              <w:rPr>
+                <w:rFonts w:ascii="Times New Roman" w:cs="Times New Roman" w:eastAsia="Times New Roman" w:hAnsi="Times New Roman"/>
+                <w:b w:val="false"/>
+                <w:bCs w:val="false"/>
+                <w:sz w:val="20"/>
+                <w:szCs w:val="20"/>
+              </w:rPr>
+              <w:t xml:space="preserve">Keyboard walk-through</w:t>
+            </w:r>
+          </w:p>
+        </w:tc>
+        <w:tc>
+          <w:tcPr>
+            <w:tcW w:type="dxa" w:w="4320"/>
+            <w:tcBorders>
+              <w:top w:val="single" w:color="999999" w:sz="4"/>
+              <w:left w:val="single" w:color="999999" w:sz="4"/>
+              <w:bottom w:val="single" w:color="999999" w:sz="4"/>
+              <w:right w:val="single" w:color="999999" w:sz="4"/>
+            </w:tcBorders>
+            <w:tcMar>
+              <w:top w:type="dxa" w:w="60"/>
+              <w:left w:type="dxa" w:w="100"/>
+              <w:bottom w:type="dxa" w:w="60"/>
+              <w:right w:type="dxa" w:w="100"/>
+            </w:tcMar>
+          </w:tcPr>
+          <w:p>
+            <w:pPr>
+              <w:spacing w:line="276"/>
+            </w:pPr>
+            <w:r>
+              <w:rPr>
+                <w:rFonts w:ascii="Times New Roman" w:cs="Times New Roman" w:eastAsia="Times New Roman" w:hAnsi="Times New Roman"/>
+                <w:b w:val="false"/>
+                <w:bCs w:val="false"/>
+                <w:sz w:val="20"/>
+                <w:szCs w:val="20"/>
+              </w:rPr>
+              <w:t xml:space="preserve">The automated accessibility scan passes; I still need to go through the main tasks using only the keyboard and record the result</w:t>
+            </w:r>
+          </w:p>
+        </w:tc>
+        <w:tc>
+          <w:tcPr>
+            <w:tcW w:type="dxa" w:w="1730"/>
+            <w:tcBorders>
+              <w:top w:val="single" w:color="999999" w:sz="4"/>
+              <w:left w:val="single" w:color="999999" w:sz="4"/>
+              <w:bottom w:val="single" w:color="999999" w:sz="4"/>
+              <w:right w:val="single" w:color="999999" w:sz="4"/>
+            </w:tcBorders>
+            <w:tcMar>
+              <w:top w:type="dxa" w:w="60"/>
+              <w:left w:type="dxa" w:w="100"/>
+              <w:bottom w:type="dxa" w:w="60"/>
+              <w:right w:type="dxa" w:w="100"/>
+            </w:tcMar>
+          </w:tcPr>
+          <w:p>
+            <w:pPr>
+              <w:spacing w:line="276"/>
+            </w:pPr>
+            <w:r>
+              <w:rPr>
+                <w:rFonts w:ascii="Times New Roman" w:cs="Times New Roman" w:eastAsia="Times New Roman" w:hAnsi="Times New Roman"/>
+                <w:b w:val="false"/>
+                <w:bCs w:val="false"/>
+                <w:sz w:val="20"/>
+                <w:szCs w:val="20"/>
+              </w:rPr>
+              <w:t xml:space="preserve">None</w:t>
             </w:r>
           </w:p>
         </w:tc>
@@ -4004,172 +4319,71 @@
         </w:trPr>
         <w:tc>
           <w:tcPr>
-            <w:tcW w:type="dxa" w:w="2664"/>
-            <w:tcBorders>
-              <w:top w:val="single" w:color="999999" w:sz="4"/>
-              <w:left w:val="single" w:color="999999" w:sz="4"/>
-              <w:bottom w:val="single" w:color="999999" w:sz="4"/>
-              <w:right w:val="single" w:color="999999" w:sz="4"/>
-            </w:tcBorders>
-            <w:tcMar>
-              <w:top w:type="dxa" w:w="60"/>
-              <w:left w:type="dxa" w:w="100"/>
-              <w:bottom w:type="dxa" w:w="60"/>
-              <w:right w:type="dxa" w:w="100"/>
-            </w:tcMar>
-          </w:tcPr>
-          <w:p>
-            <w:pPr>
-              <w:spacing w:line="276"/>
-            </w:pPr>
-            <w:r>
-              <w:rPr>
-                <w:rFonts w:ascii="Times New Roman" w:cs="Times New Roman" w:eastAsia="Times New Roman" w:hAnsi="Times New Roman"/>
-                <w:b w:val="false"/>
-                <w:bCs w:val="false"/>
-                <w:sz w:val="20"/>
-                <w:szCs w:val="20"/>
-              </w:rPr>
-              <w:t xml:space="preserve">Changes from usability sessions</w:t>
-            </w:r>
-          </w:p>
-        </w:tc>
-        <w:tc>
-          <w:tcPr>
-            <w:tcW w:type="dxa" w:w="3868"/>
-            <w:tcBorders>
-              <w:top w:val="single" w:color="999999" w:sz="4"/>
-              <w:left w:val="single" w:color="999999" w:sz="4"/>
-              <w:bottom w:val="single" w:color="999999" w:sz="4"/>
-              <w:right w:val="single" w:color="999999" w:sz="4"/>
-            </w:tcBorders>
-            <w:tcMar>
-              <w:top w:type="dxa" w:w="60"/>
-              <w:left w:type="dxa" w:w="100"/>
-              <w:bottom w:type="dxa" w:w="60"/>
-              <w:right w:type="dxa" w:w="100"/>
-            </w:tcMar>
-          </w:tcPr>
-          <w:p>
-            <w:pPr>
-              <w:spacing w:line="276"/>
-            </w:pPr>
-            <w:r>
-              <w:rPr>
-                <w:rFonts w:ascii="Times New Roman" w:cs="Times New Roman" w:eastAsia="Times New Roman" w:hAnsi="Times New Roman"/>
-                <w:b w:val="false"/>
-                <w:bCs w:val="false"/>
-                <w:sz w:val="20"/>
-                <w:szCs w:val="20"/>
-              </w:rPr>
-              <w:t xml:space="preserve">Fix problems found by real users, then re-test the affected tasks</w:t>
-            </w:r>
-          </w:p>
-        </w:tc>
-        <w:tc>
-          <w:tcPr>
-            <w:tcW w:type="dxa" w:w="2494"/>
-            <w:tcBorders>
-              <w:top w:val="single" w:color="999999" w:sz="4"/>
-              <w:left w:val="single" w:color="999999" w:sz="4"/>
-              <w:bottom w:val="single" w:color="999999" w:sz="4"/>
-              <w:right w:val="single" w:color="999999" w:sz="4"/>
-            </w:tcBorders>
-            <w:tcMar>
-              <w:top w:type="dxa" w:w="60"/>
-              <w:left w:type="dxa" w:w="100"/>
-              <w:bottom w:type="dxa" w:w="60"/>
-              <w:right w:type="dxa" w:w="100"/>
-            </w:tcMar>
-          </w:tcPr>
-          <w:p>
-            <w:pPr>
-              <w:spacing w:line="276"/>
-            </w:pPr>
-            <w:r>
-              <w:rPr>
-                <w:rFonts w:ascii="Times New Roman" w:cs="Times New Roman" w:eastAsia="Times New Roman" w:hAnsi="Times New Roman"/>
-                <w:b w:val="false"/>
-                <w:bCs w:val="false"/>
-                <w:sz w:val="20"/>
-                <w:szCs w:val="20"/>
-              </w:rPr>
-              <w:t xml:space="preserve">Usability sessions</w:t>
-            </w:r>
-          </w:p>
-        </w:tc>
-      </w:tr>
-      <w:tr>
-        <w:trPr>
-          <w:tblHeader w:val="off"/>
-        </w:trPr>
-        <w:tc>
-          <w:tcPr>
-            <w:tcW w:type="dxa" w:w="2664"/>
-            <w:tcBorders>
-              <w:top w:val="single" w:color="999999" w:sz="4"/>
-              <w:left w:val="single" w:color="999999" w:sz="4"/>
-              <w:bottom w:val="single" w:color="999999" w:sz="4"/>
-              <w:right w:val="single" w:color="999999" w:sz="4"/>
-            </w:tcBorders>
-            <w:tcMar>
-              <w:top w:type="dxa" w:w="60"/>
-              <w:left w:type="dxa" w:w="100"/>
-              <w:bottom w:type="dxa" w:w="60"/>
-              <w:right w:type="dxa" w:w="100"/>
-            </w:tcMar>
-          </w:tcPr>
-          <w:p>
-            <w:pPr>
-              <w:spacing w:line="276"/>
-            </w:pPr>
-            <w:r>
-              <w:rPr>
-                <w:rFonts w:ascii="Times New Roman" w:cs="Times New Roman" w:eastAsia="Times New Roman" w:hAnsi="Times New Roman"/>
-                <w:b w:val="false"/>
-                <w:bCs w:val="false"/>
-                <w:sz w:val="20"/>
-                <w:szCs w:val="20"/>
-              </w:rPr>
-              <w:t xml:space="preserve">Backup and restore</w:t>
-            </w:r>
-          </w:p>
-        </w:tc>
-        <w:tc>
-          <w:tcPr>
-            <w:tcW w:type="dxa" w:w="3868"/>
-            <w:tcBorders>
-              <w:top w:val="single" w:color="999999" w:sz="4"/>
-              <w:left w:val="single" w:color="999999" w:sz="4"/>
-              <w:bottom w:val="single" w:color="999999" w:sz="4"/>
-              <w:right w:val="single" w:color="999999" w:sz="4"/>
-            </w:tcBorders>
-            <w:tcMar>
-              <w:top w:type="dxa" w:w="60"/>
-              <w:left w:type="dxa" w:w="100"/>
-              <w:bottom w:type="dxa" w:w="60"/>
-              <w:right w:type="dxa" w:w="100"/>
-            </w:tcMar>
-          </w:tcPr>
-          <w:p>
-            <w:pPr>
-              <w:spacing w:line="276"/>
-            </w:pPr>
-            <w:r>
-              <w:rPr>
-                <w:rFonts w:ascii="Times New Roman" w:cs="Times New Roman" w:eastAsia="Times New Roman" w:hAnsi="Times New Roman"/>
-                <w:b w:val="false"/>
-                <w:bCs w:val="false"/>
-                <w:sz w:val="20"/>
-                <w:szCs w:val="20"/>
-              </w:rPr>
-              <w:t xml:space="preserve">Write and test once a backup and restore procedure (requirement NFR-06)</w:t>
-            </w:r>
-          </w:p>
-        </w:tc>
-        <w:tc>
-          <w:tcPr>
-            <w:tcW w:type="dxa" w:w="2494"/>
+            <w:tcW w:type="dxa" w:w="2976"/>
+            <w:tcBorders>
+              <w:top w:val="single" w:color="999999" w:sz="4"/>
+              <w:left w:val="single" w:color="999999" w:sz="4"/>
+              <w:bottom w:val="single" w:color="999999" w:sz="4"/>
+              <w:right w:val="single" w:color="999999" w:sz="4"/>
+            </w:tcBorders>
+            <w:tcMar>
+              <w:top w:type="dxa" w:w="60"/>
+              <w:left w:type="dxa" w:w="100"/>
+              <w:bottom w:type="dxa" w:w="60"/>
+              <w:right w:type="dxa" w:w="100"/>
+            </w:tcMar>
+          </w:tcPr>
+          <w:p>
+            <w:pPr>
+              <w:spacing w:line="276"/>
+            </w:pPr>
+            <w:r>
+              <w:rPr>
+                <w:rFonts w:ascii="Times New Roman" w:cs="Times New Roman" w:eastAsia="Times New Roman" w:hAnsi="Times New Roman"/>
+                <w:b w:val="false"/>
+                <w:bCs w:val="false"/>
+                <w:sz w:val="20"/>
+                <w:szCs w:val="20"/>
+              </w:rPr>
+              <w:t xml:space="preserve">Final diagrams</w:t>
+            </w:r>
+          </w:p>
+        </w:tc>
+        <w:tc>
+          <w:tcPr>
+            <w:tcW w:type="dxa" w:w="4320"/>
+            <w:tcBorders>
+              <w:top w:val="single" w:color="999999" w:sz="4"/>
+              <w:left w:val="single" w:color="999999" w:sz="4"/>
+              <w:bottom w:val="single" w:color="999999" w:sz="4"/>
+              <w:right w:val="single" w:color="999999" w:sz="4"/>
+            </w:tcBorders>
+            <w:tcMar>
+              <w:top w:type="dxa" w:w="60"/>
+              <w:left w:type="dxa" w:w="100"/>
+              <w:bottom w:type="dxa" w:w="60"/>
+              <w:right w:type="dxa" w:w="100"/>
+            </w:tcMar>
+          </w:tcPr>
+          <w:p>
+            <w:pPr>
+              <w:spacing w:line="276"/>
+            </w:pPr>
+            <w:r>
+              <w:rPr>
+                <w:rFonts w:ascii="Times New Roman" w:cs="Times New Roman" w:eastAsia="Times New Roman" w:hAnsi="Times New Roman"/>
+                <w:b w:val="false"/>
+                <w:bCs w:val="false"/>
+                <w:sz w:val="20"/>
+                <w:szCs w:val="20"/>
+              </w:rPr>
+              <w:t xml:space="preserve">Redraw the design diagrams in StarUML and Visual Paradigm as the faculty requires</w:t>
+            </w:r>
+          </w:p>
+        </w:tc>
+        <w:tc>
+          <w:tcPr>
+            <w:tcW w:type="dxa" w:w="1730"/>
             <w:tcBorders>
               <w:top w:val="single" w:color="999999" w:sz="4"/>
               <w:left w:val="single" w:color="999999" w:sz="4"/>
@@ -4196,309 +4410,6 @@
                 <w:szCs w:val="20"/>
               </w:rPr>
               <w:t xml:space="preserve">None</w:t>
-            </w:r>
-          </w:p>
-        </w:tc>
-      </w:tr>
-      <w:tr>
-        <w:trPr>
-          <w:tblHeader w:val="off"/>
-        </w:trPr>
-        <w:tc>
-          <w:tcPr>
-            <w:tcW w:type="dxa" w:w="2664"/>
-            <w:tcBorders>
-              <w:top w:val="single" w:color="999999" w:sz="4"/>
-              <w:left w:val="single" w:color="999999" w:sz="4"/>
-              <w:bottom w:val="single" w:color="999999" w:sz="4"/>
-              <w:right w:val="single" w:color="999999" w:sz="4"/>
-            </w:tcBorders>
-            <w:tcMar>
-              <w:top w:type="dxa" w:w="60"/>
-              <w:left w:type="dxa" w:w="100"/>
-              <w:bottom w:type="dxa" w:w="60"/>
-              <w:right w:type="dxa" w:w="100"/>
-            </w:tcMar>
-          </w:tcPr>
-          <w:p>
-            <w:pPr>
-              <w:spacing w:line="276"/>
-            </w:pPr>
-            <w:r>
-              <w:rPr>
-                <w:rFonts w:ascii="Times New Roman" w:cs="Times New Roman" w:eastAsia="Times New Roman" w:hAnsi="Times New Roman"/>
-                <w:b w:val="false"/>
-                <w:bCs w:val="false"/>
-                <w:sz w:val="20"/>
-                <w:szCs w:val="20"/>
-              </w:rPr>
-              <w:t xml:space="preserve">Accessibility check</w:t>
-            </w:r>
-          </w:p>
-        </w:tc>
-        <w:tc>
-          <w:tcPr>
-            <w:tcW w:type="dxa" w:w="3868"/>
-            <w:tcBorders>
-              <w:top w:val="single" w:color="999999" w:sz="4"/>
-              <w:left w:val="single" w:color="999999" w:sz="4"/>
-              <w:bottom w:val="single" w:color="999999" w:sz="4"/>
-              <w:right w:val="single" w:color="999999" w:sz="4"/>
-            </w:tcBorders>
-            <w:tcMar>
-              <w:top w:type="dxa" w:w="60"/>
-              <w:left w:type="dxa" w:w="100"/>
-              <w:bottom w:type="dxa" w:w="60"/>
-              <w:right w:type="dxa" w:w="100"/>
-            </w:tcMar>
-          </w:tcPr>
-          <w:p>
-            <w:pPr>
-              <w:spacing w:line="276"/>
-            </w:pPr>
-            <w:r>
-              <w:rPr>
-                <w:rFonts w:ascii="Times New Roman" w:cs="Times New Roman" w:eastAsia="Times New Roman" w:hAnsi="Times New Roman"/>
-                <w:b w:val="false"/>
-                <w:bCs w:val="false"/>
-                <w:sz w:val="20"/>
-                <w:szCs w:val="20"/>
-              </w:rPr>
-              <w:t xml:space="preserve">Run a formal accessibility check of colour contrast and keyboard use (NFR-08)</w:t>
-            </w:r>
-          </w:p>
-        </w:tc>
-        <w:tc>
-          <w:tcPr>
-            <w:tcW w:type="dxa" w:w="2494"/>
-            <w:tcBorders>
-              <w:top w:val="single" w:color="999999" w:sz="4"/>
-              <w:left w:val="single" w:color="999999" w:sz="4"/>
-              <w:bottom w:val="single" w:color="999999" w:sz="4"/>
-              <w:right w:val="single" w:color="999999" w:sz="4"/>
-            </w:tcBorders>
-            <w:tcMar>
-              <w:top w:type="dxa" w:w="60"/>
-              <w:left w:type="dxa" w:w="100"/>
-              <w:bottom w:type="dxa" w:w="60"/>
-              <w:right w:type="dxa" w:w="100"/>
-            </w:tcMar>
-          </w:tcPr>
-          <w:p>
-            <w:pPr>
-              <w:spacing w:line="276"/>
-            </w:pPr>
-            <w:r>
-              <w:rPr>
-                <w:rFonts w:ascii="Times New Roman" w:cs="Times New Roman" w:eastAsia="Times New Roman" w:hAnsi="Times New Roman"/>
-                <w:b w:val="false"/>
-                <w:bCs w:val="false"/>
-                <w:sz w:val="20"/>
-                <w:szCs w:val="20"/>
-              </w:rPr>
-              <w:t xml:space="preserve">None</w:t>
-            </w:r>
-          </w:p>
-        </w:tc>
-      </w:tr>
-      <w:tr>
-        <w:trPr>
-          <w:tblHeader w:val="off"/>
-        </w:trPr>
-        <w:tc>
-          <w:tcPr>
-            <w:tcW w:type="dxa" w:w="2664"/>
-            <w:tcBorders>
-              <w:top w:val="single" w:color="999999" w:sz="4"/>
-              <w:left w:val="single" w:color="999999" w:sz="4"/>
-              <w:bottom w:val="single" w:color="999999" w:sz="4"/>
-              <w:right w:val="single" w:color="999999" w:sz="4"/>
-            </w:tcBorders>
-            <w:tcMar>
-              <w:top w:type="dxa" w:w="60"/>
-              <w:left w:type="dxa" w:w="100"/>
-              <w:bottom w:type="dxa" w:w="60"/>
-              <w:right w:type="dxa" w:w="100"/>
-            </w:tcMar>
-          </w:tcPr>
-          <w:p>
-            <w:pPr>
-              <w:spacing w:line="276"/>
-            </w:pPr>
-            <w:r>
-              <w:rPr>
-                <w:rFonts w:ascii="Times New Roman" w:cs="Times New Roman" w:eastAsia="Times New Roman" w:hAnsi="Times New Roman"/>
-                <w:b w:val="false"/>
-                <w:bCs w:val="false"/>
-                <w:sz w:val="20"/>
-                <w:szCs w:val="20"/>
-              </w:rPr>
-              <w:t xml:space="preserve">Final diagrams</w:t>
-            </w:r>
-          </w:p>
-        </w:tc>
-        <w:tc>
-          <w:tcPr>
-            <w:tcW w:type="dxa" w:w="3868"/>
-            <w:tcBorders>
-              <w:top w:val="single" w:color="999999" w:sz="4"/>
-              <w:left w:val="single" w:color="999999" w:sz="4"/>
-              <w:bottom w:val="single" w:color="999999" w:sz="4"/>
-              <w:right w:val="single" w:color="999999" w:sz="4"/>
-            </w:tcBorders>
-            <w:tcMar>
-              <w:top w:type="dxa" w:w="60"/>
-              <w:left w:type="dxa" w:w="100"/>
-              <w:bottom w:type="dxa" w:w="60"/>
-              <w:right w:type="dxa" w:w="100"/>
-            </w:tcMar>
-          </w:tcPr>
-          <w:p>
-            <w:pPr>
-              <w:spacing w:line="276"/>
-            </w:pPr>
-            <w:r>
-              <w:rPr>
-                <w:rFonts w:ascii="Times New Roman" w:cs="Times New Roman" w:eastAsia="Times New Roman" w:hAnsi="Times New Roman"/>
-                <w:b w:val="false"/>
-                <w:bCs w:val="false"/>
-                <w:sz w:val="20"/>
-                <w:szCs w:val="20"/>
-              </w:rPr>
-              <w:t xml:space="preserve">Redraw the design diagrams in StarUML and Visual Paradigm as the faculty requires</w:t>
-            </w:r>
-          </w:p>
-        </w:tc>
-        <w:tc>
-          <w:tcPr>
-            <w:tcW w:type="dxa" w:w="2494"/>
-            <w:tcBorders>
-              <w:top w:val="single" w:color="999999" w:sz="4"/>
-              <w:left w:val="single" w:color="999999" w:sz="4"/>
-              <w:bottom w:val="single" w:color="999999" w:sz="4"/>
-              <w:right w:val="single" w:color="999999" w:sz="4"/>
-            </w:tcBorders>
-            <w:tcMar>
-              <w:top w:type="dxa" w:w="60"/>
-              <w:left w:type="dxa" w:w="100"/>
-              <w:bottom w:type="dxa" w:w="60"/>
-              <w:right w:type="dxa" w:w="100"/>
-            </w:tcMar>
-          </w:tcPr>
-          <w:p>
-            <w:pPr>
-              <w:spacing w:line="276"/>
-            </w:pPr>
-            <w:r>
-              <w:rPr>
-                <w:rFonts w:ascii="Times New Roman" w:cs="Times New Roman" w:eastAsia="Times New Roman" w:hAnsi="Times New Roman"/>
-                <w:b w:val="false"/>
-                <w:bCs w:val="false"/>
-                <w:sz w:val="20"/>
-                <w:szCs w:val="20"/>
-              </w:rPr>
-              <w:t xml:space="preserve">None</w:t>
-            </w:r>
-          </w:p>
-        </w:tc>
-      </w:tr>
-      <w:tr>
-        <w:trPr>
-          <w:tblHeader w:val="off"/>
-        </w:trPr>
-        <w:tc>
-          <w:tcPr>
-            <w:tcW w:type="dxa" w:w="2664"/>
-            <w:tcBorders>
-              <w:top w:val="single" w:color="999999" w:sz="4"/>
-              <w:left w:val="single" w:color="999999" w:sz="4"/>
-              <w:bottom w:val="single" w:color="999999" w:sz="4"/>
-              <w:right w:val="single" w:color="999999" w:sz="4"/>
-            </w:tcBorders>
-            <w:tcMar>
-              <w:top w:type="dxa" w:w="60"/>
-              <w:left w:type="dxa" w:w="100"/>
-              <w:bottom w:type="dxa" w:w="60"/>
-              <w:right w:type="dxa" w:w="100"/>
-            </w:tcMar>
-          </w:tcPr>
-          <w:p>
-            <w:pPr>
-              <w:spacing w:line="276"/>
-            </w:pPr>
-            <w:r>
-              <w:rPr>
-                <w:rFonts w:ascii="Times New Roman" w:cs="Times New Roman" w:eastAsia="Times New Roman" w:hAnsi="Times New Roman"/>
-                <w:b w:val="false"/>
-                <w:bCs w:val="false"/>
-                <w:sz w:val="20"/>
-                <w:szCs w:val="20"/>
-              </w:rPr>
-              <w:t xml:space="preserve">Excel export</w:t>
-            </w:r>
-          </w:p>
-        </w:tc>
-        <w:tc>
-          <w:tcPr>
-            <w:tcW w:type="dxa" w:w="3868"/>
-            <w:tcBorders>
-              <w:top w:val="single" w:color="999999" w:sz="4"/>
-              <w:left w:val="single" w:color="999999" w:sz="4"/>
-              <w:bottom w:val="single" w:color="999999" w:sz="4"/>
-              <w:right w:val="single" w:color="999999" w:sz="4"/>
-            </w:tcBorders>
-            <w:tcMar>
-              <w:top w:type="dxa" w:w="60"/>
-              <w:left w:type="dxa" w:w="100"/>
-              <w:bottom w:type="dxa" w:w="60"/>
-              <w:right w:type="dxa" w:w="100"/>
-            </w:tcMar>
-          </w:tcPr>
-          <w:p>
-            <w:pPr>
-              <w:spacing w:line="276"/>
-            </w:pPr>
-            <w:r>
-              <w:rPr>
-                <w:rFonts w:ascii="Times New Roman" w:cs="Times New Roman" w:eastAsia="Times New Roman" w:hAnsi="Times New Roman"/>
-                <w:b w:val="false"/>
-                <w:bCs w:val="false"/>
-                <w:sz w:val="20"/>
-                <w:szCs w:val="20"/>
-              </w:rPr>
-              <w:t xml:space="preserve">Not built; optional in my plan and the first item to drop if time is short</w:t>
-            </w:r>
-          </w:p>
-        </w:tc>
-        <w:tc>
-          <w:tcPr>
-            <w:tcW w:type="dxa" w:w="2494"/>
-            <w:tcBorders>
-              <w:top w:val="single" w:color="999999" w:sz="4"/>
-              <w:left w:val="single" w:color="999999" w:sz="4"/>
-              <w:bottom w:val="single" w:color="999999" w:sz="4"/>
-              <w:right w:val="single" w:color="999999" w:sz="4"/>
-            </w:tcBorders>
-            <w:tcMar>
-              <w:top w:type="dxa" w:w="60"/>
-              <w:left w:type="dxa" w:w="100"/>
-              <w:bottom w:type="dxa" w:w="60"/>
-              <w:right w:type="dxa" w:w="100"/>
-            </w:tcMar>
-          </w:tcPr>
-          <w:p>
-            <w:pPr>
-              <w:spacing w:line="276"/>
-            </w:pPr>
-            <w:r>
-              <w:rPr>
-                <w:rFonts w:ascii="Times New Roman" w:cs="Times New Roman" w:eastAsia="Times New Roman" w:hAnsi="Times New Roman"/>
-                <w:b w:val="false"/>
-                <w:bCs w:val="false"/>
-                <w:sz w:val="20"/>
-                <w:szCs w:val="20"/>
-              </w:rPr>
-              <w:t xml:space="preserve">Time</w:t>
             </w:r>
           </w:p>
         </w:tc>
@@ -5146,7 +5057,7 @@
           <w:sz w:val="24"/>
           <w:szCs w:val="24"/>
         </w:rPr>
-        <w:t xml:space="preserve">Duplicate rule</w:t>
+        <w:t xml:space="preserve">Duplicate rule:</w:t>
       </w:r>
       <w:r>
         <w:rPr>
@@ -5156,7 +5067,7 @@
           <w:sz w:val="24"/>
           <w:szCs w:val="24"/>
         </w:rPr>
-        <w:t xml:space="preserve"> option described in Section 5.</w:t>
+        <w:t xml:space="preserve"> whether the small fall in recall (Section 5) is acceptable as a reported limitation.</w:t>
       </w:r>
     </w:p>
     <w:p>
@@ -5414,7 +5325,7 @@
                 <w:sz w:val="20"/>
                 <w:szCs w:val="20"/>
               </w:rPr>
-              <w:t xml:space="preserve">Complete the Chapter 2 and 3 corrections; start interviews and the questionnaire; decide the open development items; write and test the backup and restore procedure</w:t>
+              <w:t xml:space="preserve">Complete the Chapter 2 and 3 corrections; start interviews and the questionnaire</w:t>
             </w:r>
           </w:p>
         </w:tc>
@@ -5483,7 +5394,7 @@
                 <w:sz w:val="20"/>
                 <w:szCs w:val="20"/>
               </w:rPr>
-              <w:t xml:space="preserve">Apply fieldwork findings to the system; run the accessibility check; hold usability sessions and fix what they reveal</w:t>
+              <w:t xml:space="preserve">Apply fieldwork findings to the system; do the keyboard walk-through; hold usability sessions and fix what they reveal</w:t>
             </w:r>
           </w:p>
         </w:tc>
@@ -5835,6 +5746,75 @@
                 <w:szCs w:val="20"/>
               </w:rPr>
               <w:t xml:space="preserve">First report: development phases 0 and 2 to 6 complete; open development items, proposal correction, fieldwork, usability, chapters and demonstration pending</w:t>
+            </w:r>
+          </w:p>
+        </w:tc>
+      </w:tr>
+      <w:tr>
+        <w:trPr>
+          <w:tblHeader w:val="off"/>
+        </w:trPr>
+        <w:tc>
+          <w:tcPr>
+            <w:tcW w:type="dxa" w:w="2474"/>
+            <w:tcBorders>
+              <w:top w:val="single" w:color="999999" w:sz="4"/>
+              <w:left w:val="single" w:color="999999" w:sz="4"/>
+              <w:bottom w:val="single" w:color="999999" w:sz="4"/>
+              <w:right w:val="single" w:color="999999" w:sz="4"/>
+            </w:tcBorders>
+            <w:tcMar>
+              <w:top w:type="dxa" w:w="60"/>
+              <w:left w:type="dxa" w:w="100"/>
+              <w:bottom w:type="dxa" w:w="60"/>
+              <w:right w:type="dxa" w:w="100"/>
+            </w:tcMar>
+          </w:tcPr>
+          <w:p>
+            <w:pPr>
+              <w:spacing w:line="276"/>
+            </w:pPr>
+            <w:r>
+              <w:rPr>
+                <w:rFonts w:ascii="Times New Roman" w:cs="Times New Roman" w:eastAsia="Times New Roman" w:hAnsi="Times New Roman"/>
+                <w:b w:val="false"/>
+                <w:bCs w:val="false"/>
+                <w:sz w:val="20"/>
+                <w:szCs w:val="20"/>
+              </w:rPr>
+              <w:t xml:space="preserve">3 October 2026</w:t>
+            </w:r>
+          </w:p>
+        </w:tc>
+        <w:tc>
+          <w:tcPr>
+            <w:tcW w:type="dxa" w:w="6552"/>
+            <w:tcBorders>
+              <w:top w:val="single" w:color="999999" w:sz="4"/>
+              <w:left w:val="single" w:color="999999" w:sz="4"/>
+              <w:bottom w:val="single" w:color="999999" w:sz="4"/>
+              <w:right w:val="single" w:color="999999" w:sz="4"/>
+            </w:tcBorders>
+            <w:tcMar>
+              <w:top w:type="dxa" w:w="60"/>
+              <w:left w:type="dxa" w:w="100"/>
+              <w:bottom w:type="dxa" w:w="60"/>
+              <w:right w:type="dxa" w:w="100"/>
+            </w:tcMar>
+          </w:tcPr>
+          <w:p>
+            <w:pPr>
+              <w:spacing w:line="276"/>
+            </w:pPr>
+            <w:r>
+              <w:rPr>
+                <w:rFonts w:ascii="Times New Roman" w:cs="Times New Roman" w:eastAsia="Times New Roman" w:hAnsi="Times New Roman"/>
+                <w:b w:val="false"/>
+                <w:bCs w:val="false"/>
+                <w:sz w:val="20"/>
+                <w:szCs w:val="20"/>
+              </w:rPr>
+              <w:t xml:space="preserve">Phase 6b complete: account rules, Excel export, clickable dashboard, backup and restore, accessibility check and the stricter duplicate rule; development items now limited to fieldwork and usability changes, ward-list check, keyboard walk-through and final diagrams</w:t>
             </w:r>
           </w:p>
         </w:tc>

</xml_diff>

<commit_message>
test(evaluation): explain duplicate recall misses and add browser evidence for account and drill-down features
</commit_message>
<xml_diff>
--- a/docs/reports/Progress_Report.docx
+++ b/docs/reports/Progress_Report.docx
@@ -2403,7 +2403,7 @@
                 <w:sz w:val="20"/>
                 <w:szCs w:val="20"/>
               </w:rPr>
-              <w:t xml:space="preserve">310 tests and 20 browser tests; backup restored into a separate database and compared table by table; accessibility scan of 13 pages in both themes on laptop and phone screens</w:t>
+              <w:t xml:space="preserve">310 tests and 28 browser tests; backup restored into a separate database and compared table by table; accessibility scan of 13 pages in both themes on laptop and phone screens</w:t>
             </w:r>
           </w:p>
         </w:tc>
@@ -2682,7 +2682,7 @@
                 <w:sz w:val="20"/>
                 <w:szCs w:val="20"/>
               </w:rPr>
-              <w:t xml:space="preserve">310 tests and 20 browser tests, all passing</w:t>
+              <w:t xml:space="preserve">310 tests and 28 browser tests, all passing</w:t>
             </w:r>
           </w:p>
         </w:tc>
@@ -3748,7 +3748,7 @@
           <w:sz w:val="24"/>
           <w:szCs w:val="24"/>
         </w:rPr>
-        <w:t xml:space="preserve">In the first evaluation duplicate precision fell to 0.775 at 100,000 records, because different incidents of the same type in the same ward within two hours often share a landmark in the sample data. I decided to also require any house or plot numbers in the two locations to match. Precision is now 0.998, but recall falls just below the target (0.890 and 0.883 at the larger sizes), because some planted copies retype the number. I have kept the target unchanged and report both results as measured.</w:t>
+        <w:t xml:space="preserve">In the first evaluation duplicate precision fell to 0.775 at 100,000 records, because different incidents of the same type in the same ward within two hours often share a landmark in the sample data. I decided to also require any house or plot numbers in the two locations to match. Precision is now 0.998, but recall falls just below the target (0.890 and 0.883 at the larger sizes). I traced every missed pair: the system finds every pair the rule allows, and the misses have two causes in the way my test data retypes copies. About 8 percent of copies add or drop a whole word in a short location (for example "near the church 121" typed as "near church 121"), which falls just under the 0.8 similarity threshold; this was the case before the change too. About 3 to 4 percent have a typing error in the house number, which the new rule correctly treats as a different place. I have kept the target unchanged, reported both results as measured, and recorded an option (ignoring filler words such as "the") to test on new data if you advise it.</w:t>
       </w:r>
     </w:p>
     <w:p>
@@ -5067,7 +5067,7 @@
           <w:sz w:val="24"/>
           <w:szCs w:val="24"/>
         </w:rPr>
-        <w:t xml:space="preserve"> whether the small fall in recall (Section 5) is acceptable as a reported limitation.</w:t>
+        <w:t xml:space="preserve"> whether the shortfall in recall (Section 5) is acceptable as a reported limitation, or whether I should test the filler-word option on new data.</w:t>
       </w:r>
     </w:p>
     <w:p>

</xml_diff>